<commit_message>
Deploying to gh-pages from @ Morrison-Lab/psc@b342b5eb93b2cc36a78388747865e506c8a6f628 🚀
</commit_message>
<xml_diff>
--- a/chapters/coding-style.docx
+++ b/chapters/coding-style.docx
@@ -15,7 +15,7 @@
         <w:pStyle w:val="Date"/>
       </w:pPr>
       <w:r>
-        <w:t xml:space="preserve">Last modified: 2026-10-12 01:04:11 (PDT)</w:t>
+        <w:t xml:space="preserve">Last modified: 2026-10-12 01:16:52 (PDT)</w:t>
       </w:r>
     </w:p>
     <w:p>
@@ -3859,7 +3859,7 @@
     </w:p>
     <w:bookmarkEnd w:id="35"/>
     <w:bookmarkEnd w:id="36"/>
-    <w:bookmarkStart w:id="40" w:name="sec-avoid-nesting"/>
+    <w:bookmarkStart w:id="43" w:name="sec-avoid-nesting"/>
     <w:p>
       <w:pPr>
         <w:pStyle w:val="Heading2"/>
@@ -3873,7 +3873,13 @@
         <w:pStyle w:val="FirstParagraph"/>
       </w:pPr>
       <w:r>
-        <w:t xml:space="preserve">When writing code, avoid nested function calls and nested function definitions where feasible:</w:t>
+        <w:t xml:space="preserve">When writing code, do not nest function calls.</w:t>
+      </w:r>
+      <w:r>
+        <w:t xml:space="preserve"> </w:t>
+      </w:r>
+      <w:r>
+        <w:t xml:space="preserve">Where feasible, also avoid nested function definitions:</w:t>
       </w:r>
     </w:p>
     <w:p>
@@ -3885,37 +3891,55 @@
         </w:numPr>
       </w:pPr>
       <w:r>
-        <w:t xml:space="preserve">Prefer named intermediate variables (or a pipe, e.g. </w:t>
+        <w:t xml:space="preserve">Do not pass one function call’s result straight into another call,</w:t>
+      </w:r>
+      <w:r>
+        <w:t xml:space="preserve"> </w:t>
+      </w:r>
+      <w:r>
+        <w:t xml:space="preserve">as in</w:t>
+      </w:r>
+      <w:r>
+        <w:t xml:space="preserve"> </w:t>
       </w:r>
       <w:r>
         <w:rPr>
           <w:rStyle w:val="VerbatimChar"/>
         </w:rPr>
+        <w:t xml:space="preserve">f(g(h(x)))</w:t>
+      </w:r>
+      <w:r>
+        <w:t xml:space="preserve">.</w:t>
+      </w:r>
+      <w:r>
+        <w:t xml:space="preserve"> </w:t>
+      </w:r>
+      <w:r>
+        <w:t xml:space="preserve">Give each intermediate result a name,</w:t>
+      </w:r>
+      <w:r>
+        <w:t xml:space="preserve"> </w:t>
+      </w:r>
+      <w:r>
+        <w:t xml:space="preserve">or chain the steps with a pipe (</w:t>
+      </w:r>
+      <w:r>
+        <w:rPr>
+          <w:rStyle w:val="VerbatimChar"/>
+        </w:rPr>
         <w:t xml:space="preserve">|&gt;</w:t>
       </w:r>
       <w:r>
         <w:t xml:space="preserve"> </w:t>
       </w:r>
       <w:r>
-        <w:t xml:space="preserve">in R)</w:t>
-      </w:r>
-      <w:r>
-        <w:t xml:space="preserve"> </w:t>
-      </w:r>
-      <w:r>
-        <w:t xml:space="preserve">over deeply nested calls like</w:t>
-      </w:r>
-      <w:r>
-        <w:t xml:space="preserve"> </w:t>
-      </w:r>
-      <w:r>
-        <w:rPr>
-          <w:rStyle w:val="VerbatimChar"/>
-        </w:rPr>
-        <w:t xml:space="preserve">f(g(h(x)))</w:t>
-      </w:r>
-      <w:r>
-        <w:t xml:space="preserve">.</w:t>
+        <w:t xml:space="preserve">in R);</w:t>
+      </w:r>
+      <w:r>
+        <w:t xml:space="preserve"> </w:t>
+      </w:r>
+      <w:r>
+        <w:t xml:space="preserve">pipes are fine.</w:t>
       </w:r>
       <w:r>
         <w:t xml:space="preserve"> </w:t>
@@ -3953,7 +3977,164 @@
         <w:pStyle w:val="FirstParagraph"/>
       </w:pPr>
       <w:r>
-        <w:t xml:space="preserve">This is a readability and maintainability default, not an absolute rule —</w:t>
+        <w:t xml:space="preserve">The nested-call rule is a policy, not a default:</w:t>
+      </w:r>
+      <w:r>
+        <w:t xml:space="preserve"> </w:t>
+      </w:r>
+      <w:r>
+        <w:t xml:space="preserve">a nested call is a code-review finding.</w:t>
+      </w:r>
+      <w:r>
+        <w:t xml:space="preserve"> </w:t>
+      </w:r>
+      <w:r>
+        <w:t xml:space="preserve">It covers a call whose result is a value handed to the outer call as an argument.</w:t>
+      </w:r>
+      <w:r>
+        <w:t xml:space="preserve"> </w:t>
+      </w:r>
+      <w:r>
+        <w:t xml:space="preserve">It does not cover the steps of a pipe chain,</w:t>
+      </w:r>
+      <w:r>
+        <w:t xml:space="preserve"> </w:t>
+      </w:r>
+      <w:r>
+        <w:t xml:space="preserve">which already name their order,</w:t>
+      </w:r>
+      <w:r>
+        <w:t xml:space="preserve"> </w:t>
+      </w:r>
+      <w:r>
+        <w:t xml:space="preserve">nor an argument the outer function captures and interprets itself:</w:t>
+      </w:r>
+      <w:r>
+        <w:t xml:space="preserve"> </w:t>
+      </w:r>
+      <w:hyperlink r:id="rId37">
+        <w:r>
+          <w:rPr>
+            <w:rStyle w:val="VerbatimChar"/>
+          </w:rPr>
+          <w:t xml:space="preserve">{tidyselect}</w:t>
+        </w:r>
+      </w:hyperlink>
+      <w:r>
+        <w:t xml:space="preserve"> </w:t>
+      </w:r>
+      <w:r>
+        <w:t xml:space="preserve">helpers (</w:t>
+      </w:r>
+      <w:r>
+        <w:rPr>
+          <w:rStyle w:val="VerbatimChar"/>
+        </w:rPr>
+        <w:t xml:space="preserve">all_of()</w:t>
+      </w:r>
+      <w:r>
+        <w:t xml:space="preserve">,</w:t>
+      </w:r>
+      <w:r>
+        <w:t xml:space="preserve"> </w:t>
+      </w:r>
+      <w:r>
+        <w:rPr>
+          <w:rStyle w:val="VerbatimChar"/>
+        </w:rPr>
+        <w:t xml:space="preserve">any_of()</w:t>
+      </w:r>
+      <w:r>
+        <w:t xml:space="preserve">,</w:t>
+      </w:r>
+      <w:r>
+        <w:t xml:space="preserve"> </w:t>
+      </w:r>
+      <w:r>
+        <w:rPr>
+          <w:rStyle w:val="VerbatimChar"/>
+        </w:rPr>
+        <w:t xml:space="preserve">starts_with()</w:t>
+      </w:r>
+      <w:r>
+        <w:t xml:space="preserve">),</w:t>
+      </w:r>
+      <w:r>
+        <w:t xml:space="preserve"> </w:t>
+      </w:r>
+      <w:r>
+        <w:t xml:space="preserve">data-masked expressions inside data-masking verbs such as</w:t>
+      </w:r>
+      <w:r>
+        <w:t xml:space="preserve"> </w:t>
+      </w:r>
+      <w:r>
+        <w:rPr>
+          <w:rStyle w:val="VerbatimChar"/>
+        </w:rPr>
+        <w:t xml:space="preserve">mutate()</w:t>
+      </w:r>
+      <w:r>
+        <w:t xml:space="preserve">,</w:t>
+      </w:r>
+      <w:r>
+        <w:t xml:space="preserve"> </w:t>
+      </w:r>
+      <w:r>
+        <w:rPr>
+          <w:rStyle w:val="VerbatimChar"/>
+        </w:rPr>
+        <w:t xml:space="preserve">filter()</w:t>
+      </w:r>
+      <w:r>
+        <w:t xml:space="preserve">, or</w:t>
+      </w:r>
+      <w:r>
+        <w:t xml:space="preserve"> </w:t>
+      </w:r>
+      <w:r>
+        <w:rPr>
+          <w:rStyle w:val="VerbatimChar"/>
+        </w:rPr>
+        <w:t xml:space="preserve">summarise()</w:t>
+      </w:r>
+      <w:r>
+        <w:t xml:space="preserve">,</w:t>
+      </w:r>
+      <w:r>
+        <w:t xml:space="preserve"> </w:t>
+      </w:r>
+      <w:r>
+        <w:rPr>
+          <w:rStyle w:val="VerbatimChar"/>
+        </w:rPr>
+        <w:t xml:space="preserve">aes()</w:t>
+      </w:r>
+      <w:r>
+        <w:t xml:space="preserve"> </w:t>
+      </w:r>
+      <w:r>
+        <w:t xml:space="preserve">mappings, and formulas.</w:t>
+      </w:r>
+      <w:r>
+        <w:t xml:space="preserve"> </w:t>
+      </w:r>
+      <w:r>
+        <w:t xml:space="preserve">Those are part of the outer call’s own syntax,</w:t>
+      </w:r>
+      <w:r>
+        <w:t xml:space="preserve"> </w:t>
+      </w:r>
+      <w:r>
+        <w:t xml:space="preserve">and pulling them out would break or obscure it.</w:t>
+      </w:r>
+    </w:p>
+    <w:p>
+      <w:pPr>
+        <w:pStyle w:val="BodyText"/>
+      </w:pPr>
+      <w:r>
+        <w:t xml:space="preserve">The nested-definition rule is a readability and maintainability default, not an absolute rule —</w:t>
       </w:r>
       <w:r>
         <w:t xml:space="preserve"> </w:t>
@@ -3968,13 +4149,549 @@
         <w:t xml:space="preserve">(a trivial one-argument wrapper, or a closure that genuinely needs the enclosing scope).</w:t>
       </w:r>
     </w:p>
-    <w:bookmarkStart w:id="38" w:name="Xe498262ae6be61f401e18dbcc7cafd360e15ce1"/>
+    <w:bookmarkStart w:id="39" w:name="sec-precompute-conditions"/>
     <w:p>
       <w:pPr>
         <w:pStyle w:val="Heading3"/>
       </w:pPr>
       <w:r>
-        <w:t xml:space="preserve">5.1 Prefer more, simpler steps over fewer, denser ones</w:t>
+        <w:t xml:space="preserve">5.1 Name</w:t>
+      </w:r>
+      <w:r>
+        <w:t xml:space="preserve"> </w:t>
+      </w:r>
+      <w:r>
+        <w:rPr>
+          <w:rStyle w:val="VerbatimChar"/>
+        </w:rPr>
+        <w:t xml:space="preserve">if()</w:t>
+      </w:r>
+      <w:r>
+        <w:t xml:space="preserve"> </w:t>
+      </w:r>
+      <w:r>
+        <w:t xml:space="preserve">and</w:t>
+      </w:r>
+      <w:r>
+        <w:t xml:space="preserve"> </w:t>
+      </w:r>
+      <w:r>
+        <w:rPr>
+          <w:rStyle w:val="VerbatimChar"/>
+        </w:rPr>
+        <w:t xml:space="preserve">while()</w:t>
+      </w:r>
+      <w:r>
+        <w:t xml:space="preserve"> </w:t>
+      </w:r>
+      <w:r>
+        <w:t xml:space="preserve">conditions before testing them</w:t>
+      </w:r>
+    </w:p>
+    <w:p>
+      <w:pPr>
+        <w:pStyle w:val="FirstParagraph"/>
+      </w:pPr>
+      <w:r>
+        <w:t xml:space="preserve">Compute every</w:t>
+      </w:r>
+      <w:r>
+        <w:t xml:space="preserve"> </w:t>
+      </w:r>
+      <w:r>
+        <w:rPr>
+          <w:rStyle w:val="VerbatimChar"/>
+        </w:rPr>
+        <w:t xml:space="preserve">if()</w:t>
+      </w:r>
+      <w:r>
+        <w:t xml:space="preserve"> </w:t>
+      </w:r>
+      <w:r>
+        <w:t xml:space="preserve">and</w:t>
+      </w:r>
+      <w:r>
+        <w:t xml:space="preserve"> </w:t>
+      </w:r>
+      <w:r>
+        <w:rPr>
+          <w:rStyle w:val="VerbatimChar"/>
+        </w:rPr>
+        <w:t xml:space="preserve">while()</w:t>
+      </w:r>
+      <w:r>
+        <w:t xml:space="preserve"> </w:t>
+      </w:r>
+      <w:r>
+        <w:t xml:space="preserve">condition ahead of the test:</w:t>
+      </w:r>
+      <w:r>
+        <w:t xml:space="preserve"> </w:t>
+      </w:r>
+      <w:r>
+        <w:t xml:space="preserve">assign it to a named logical variable first,</w:t>
+      </w:r>
+      <w:r>
+        <w:t xml:space="preserve"> </w:t>
+      </w:r>
+      <w:r>
+        <w:t xml:space="preserve">then test that name,</w:t>
+      </w:r>
+      <w:r>
+        <w:t xml:space="preserve"> </w:t>
+      </w:r>
+      <w:r>
+        <w:t xml:space="preserve">so the condition inside the parentheses is always a bare name</w:t>
+      </w:r>
+      <w:r>
+        <w:t xml:space="preserve"> </w:t>
+      </w:r>
+      <w:r>
+        <w:t xml:space="preserve">(or a literal, as in</w:t>
+      </w:r>
+      <w:r>
+        <w:t xml:space="preserve"> </w:t>
+      </w:r>
+      <w:r>
+        <w:rPr>
+          <w:rStyle w:val="VerbatimChar"/>
+        </w:rPr>
+        <w:t xml:space="preserve">while (TRUE)</w:t>
+      </w:r>
+      <w:r>
+        <w:t xml:space="preserve">).</w:t>
+      </w:r>
+      <w:r>
+        <w:t xml:space="preserve"> </w:t>
+      </w:r>
+      <w:r>
+        <w:t xml:space="preserve">This holds even for a condition with no nested call, such as</w:t>
+      </w:r>
+      <w:r>
+        <w:t xml:space="preserve"> </w:t>
+      </w:r>
+      <w:r>
+        <w:rPr>
+          <w:rStyle w:val="VerbatimChar"/>
+        </w:rPr>
+        <w:t xml:space="preserve">is.na(strat)</w:t>
+      </w:r>
+      <w:r>
+        <w:t xml:space="preserve">,</w:t>
+      </w:r>
+      <w:r>
+        <w:t xml:space="preserve"> </w:t>
+      </w:r>
+      <w:r>
+        <w:t xml:space="preserve">because the name is what documents the test.</w:t>
+      </w:r>
+    </w:p>
+    <w:p>
+      <w:pPr>
+        <w:pStyle w:val="SourceCode"/>
+      </w:pPr>
+      <w:r>
+        <w:rPr>
+          <w:rStyle w:val="CommentTok"/>
+        </w:rPr>
+        <w:t xml:space="preserve"># Good: the name states what the test means</w:t>
+      </w:r>
+      <w:r>
+        <w:br/>
+      </w:r>
+      <w:r>
+        <w:rPr>
+          <w:rStyle w:val="NormalTok"/>
+        </w:rPr>
+        <w:t xml:space="preserve">n_plots </w:t>
+      </w:r>
+      <w:r>
+        <w:rPr>
+          <w:rStyle w:val="OtherTok"/>
+        </w:rPr>
+        <w:t xml:space="preserve">&lt;-</w:t>
+      </w:r>
+      <w:r>
+        <w:rPr>
+          <w:rStyle w:val="NormalTok"/>
+        </w:rPr>
+        <w:t xml:space="preserve"> trace_strat_list </w:t>
+      </w:r>
+      <w:r>
+        <w:rPr>
+          <w:rStyle w:val="SpecialCharTok"/>
+        </w:rPr>
+        <w:t xml:space="preserve">|&gt;</w:t>
+      </w:r>
+      <w:r>
+        <w:rPr>
+          <w:rStyle w:val="NormalTok"/>
+        </w:rPr>
+        <w:t xml:space="preserve"> </w:t>
+      </w:r>
+      <w:r>
+        <w:rPr>
+          <w:rStyle w:val="FunctionTok"/>
+        </w:rPr>
+        <w:t xml:space="preserve">lengths</w:t>
+      </w:r>
+      <w:r>
+        <w:rPr>
+          <w:rStyle w:val="NormalTok"/>
+        </w:rPr>
+        <w:t xml:space="preserve">() </w:t>
+      </w:r>
+      <w:r>
+        <w:rPr>
+          <w:rStyle w:val="SpecialCharTok"/>
+        </w:rPr>
+        <w:t xml:space="preserve">|&gt;</w:t>
+      </w:r>
+      <w:r>
+        <w:rPr>
+          <w:rStyle w:val="NormalTok"/>
+        </w:rPr>
+        <w:t xml:space="preserve"> </w:t>
+      </w:r>
+      <w:r>
+        <w:rPr>
+          <w:rStyle w:val="FunctionTok"/>
+        </w:rPr>
+        <w:t xml:space="preserve">sum</w:t>
+      </w:r>
+      <w:r>
+        <w:rPr>
+          <w:rStyle w:val="NormalTok"/>
+        </w:rPr>
+        <w:t xml:space="preserve">()</w:t>
+      </w:r>
+      <w:r>
+        <w:br/>
+      </w:r>
+      <w:r>
+        <w:rPr>
+          <w:rStyle w:val="NormalTok"/>
+        </w:rPr>
+        <w:t xml:space="preserve">single_plot </w:t>
+      </w:r>
+      <w:r>
+        <w:rPr>
+          <w:rStyle w:val="OtherTok"/>
+        </w:rPr>
+        <w:t xml:space="preserve">&lt;-</w:t>
+      </w:r>
+      <w:r>
+        <w:rPr>
+          <w:rStyle w:val="NormalTok"/>
+        </w:rPr>
+        <w:t xml:space="preserve"> n_plots </w:t>
+      </w:r>
+      <w:r>
+        <w:rPr>
+          <w:rStyle w:val="SpecialCharTok"/>
+        </w:rPr>
+        <w:t xml:space="preserve">==</w:t>
+      </w:r>
+      <w:r>
+        <w:rPr>
+          <w:rStyle w:val="NormalTok"/>
+        </w:rPr>
+        <w:t xml:space="preserve"> </w:t>
+      </w:r>
+      <w:r>
+        <w:rPr>
+          <w:rStyle w:val="DecValTok"/>
+        </w:rPr>
+        <w:t xml:space="preserve">1</w:t>
+      </w:r>
+      <w:r>
+        <w:br/>
+      </w:r>
+      <w:r>
+        <w:rPr>
+          <w:rStyle w:val="ControlFlowTok"/>
+        </w:rPr>
+        <w:t xml:space="preserve">if</w:t>
+      </w:r>
+      <w:r>
+        <w:rPr>
+          <w:rStyle w:val="NormalTok"/>
+        </w:rPr>
+        <w:t xml:space="preserve"> (single_plot) {</w:t>
+      </w:r>
+      <w:r>
+        <w:br/>
+      </w:r>
+      <w:r>
+        <w:rPr>
+          <w:rStyle w:val="NormalTok"/>
+        </w:rPr>
+        <w:t xml:space="preserve">  </w:t>
+      </w:r>
+      <w:r>
+        <w:rPr>
+          <w:rStyle w:val="CommentTok"/>
+        </w:rPr>
+        <w:t xml:space="preserve"># ...</w:t>
+      </w:r>
+      <w:r>
+        <w:br/>
+      </w:r>
+      <w:r>
+        <w:rPr>
+          <w:rStyle w:val="NormalTok"/>
+        </w:rPr>
+        <w:t xml:space="preserve">}</w:t>
+      </w:r>
+      <w:r>
+        <w:br/>
+      </w:r>
+      <w:r>
+        <w:br/>
+      </w:r>
+      <w:r>
+        <w:rPr>
+          <w:rStyle w:val="CommentTok"/>
+        </w:rPr>
+        <w:t xml:space="preserve"># Avoid: the inline expression hides a misplaced parenthesis</w:t>
+      </w:r>
+      <w:r>
+        <w:br/>
+      </w:r>
+      <w:r>
+        <w:rPr>
+          <w:rStyle w:val="ControlFlowTok"/>
+        </w:rPr>
+        <w:t xml:space="preserve">if</w:t>
+      </w:r>
+      <w:r>
+        <w:rPr>
+          <w:rStyle w:val="NormalTok"/>
+        </w:rPr>
+        <w:t xml:space="preserve"> (</w:t>
+      </w:r>
+      <w:r>
+        <w:rPr>
+          <w:rStyle w:val="FunctionTok"/>
+        </w:rPr>
+        <w:t xml:space="preserve">sum</w:t>
+      </w:r>
+      <w:r>
+        <w:rPr>
+          <w:rStyle w:val="NormalTok"/>
+        </w:rPr>
+        <w:t xml:space="preserve">(</w:t>
+      </w:r>
+      <w:r>
+        <w:rPr>
+          <w:rStyle w:val="FunctionTok"/>
+        </w:rPr>
+        <w:t xml:space="preserve">lengths</w:t>
+      </w:r>
+      <w:r>
+        <w:rPr>
+          <w:rStyle w:val="NormalTok"/>
+        </w:rPr>
+        <w:t xml:space="preserve">(trace_strat_list) </w:t>
+      </w:r>
+      <w:r>
+        <w:rPr>
+          <w:rStyle w:val="SpecialCharTok"/>
+        </w:rPr>
+        <w:t xml:space="preserve">==</w:t>
+      </w:r>
+      <w:r>
+        <w:rPr>
+          <w:rStyle w:val="NormalTok"/>
+        </w:rPr>
+        <w:t xml:space="preserve"> </w:t>
+      </w:r>
+      <w:r>
+        <w:rPr>
+          <w:rStyle w:val="DecValTok"/>
+        </w:rPr>
+        <w:t xml:space="preserve">1</w:t>
+      </w:r>
+      <w:r>
+        <w:rPr>
+          <w:rStyle w:val="NormalTok"/>
+        </w:rPr>
+        <w:t xml:space="preserve">)) {</w:t>
+      </w:r>
+      <w:r>
+        <w:br/>
+      </w:r>
+      <w:r>
+        <w:rPr>
+          <w:rStyle w:val="NormalTok"/>
+        </w:rPr>
+        <w:t xml:space="preserve">  </w:t>
+      </w:r>
+      <w:r>
+        <w:rPr>
+          <w:rStyle w:val="CommentTok"/>
+        </w:rPr>
+        <w:t xml:space="preserve"># ...</w:t>
+      </w:r>
+      <w:r>
+        <w:br/>
+      </w:r>
+      <w:r>
+        <w:rPr>
+          <w:rStyle w:val="NormalTok"/>
+        </w:rPr>
+        <w:t xml:space="preserve">}</w:t>
+      </w:r>
+    </w:p>
+    <w:p>
+      <w:pPr>
+        <w:pStyle w:val="FirstParagraph"/>
+      </w:pPr>
+      <w:r>
+        <w:t xml:space="preserve">For a</w:t>
+      </w:r>
+      <w:r>
+        <w:t xml:space="preserve"> </w:t>
+      </w:r>
+      <w:r>
+        <w:rPr>
+          <w:rStyle w:val="VerbatimChar"/>
+        </w:rPr>
+        <w:t xml:space="preserve">while()</w:t>
+      </w:r>
+      <w:r>
+        <w:t xml:space="preserve"> </w:t>
+      </w:r>
+      <w:r>
+        <w:t xml:space="preserve">loop,</w:t>
+      </w:r>
+      <w:r>
+        <w:t xml:space="preserve"> </w:t>
+      </w:r>
+      <w:r>
+        <w:t xml:space="preserve">compute the named condition before the loop</w:t>
+      </w:r>
+      <w:r>
+        <w:t xml:space="preserve"> </w:t>
+      </w:r>
+      <w:r>
+        <w:t xml:space="preserve">and recompute it at the end of the loop body.</w:t>
+      </w:r>
+    </w:p>
+    <w:p>
+      <w:pPr>
+        <w:pStyle w:val="BodyText"/>
+      </w:pPr>
+      <w:r>
+        <w:t xml:space="preserve">The inline form above was a real bug,</w:t>
+      </w:r>
+      <w:r>
+        <w:t xml:space="preserve"> </w:t>
+      </w:r>
+      <w:r>
+        <w:t xml:space="preserve">fixed in</w:t>
+      </w:r>
+      <w:r>
+        <w:t xml:space="preserve"> </w:t>
+      </w:r>
+      <w:hyperlink r:id="rId38">
+        <w:r>
+          <w:rPr>
+            <w:rStyle w:val="VerbatimChar"/>
+          </w:rPr>
+          <w:t xml:space="preserve">{serodynamics}</w:t>
+        </w:r>
+        <w:r>
+          <w:rPr>
+            <w:rStyle w:val="Hyperlink"/>
+          </w:rPr>
+          <w:t xml:space="preserve"> </w:t>
+        </w:r>
+        <w:r>
+          <w:rPr>
+            <w:rStyle w:val="Hyperlink"/>
+          </w:rPr>
+          <w:t xml:space="preserve">PR #326</w:t>
+        </w:r>
+      </w:hyperlink>
+      <w:r>
+        <w:t xml:space="preserve">.</w:t>
+      </w:r>
+      <w:r>
+        <w:t xml:space="preserve"> </w:t>
+      </w:r>
+      <w:r>
+        <w:rPr>
+          <w:rStyle w:val="VerbatimChar"/>
+        </w:rPr>
+        <w:t xml:space="preserve">sum(lengths(x) == 1)</w:t>
+      </w:r>
+      <w:r>
+        <w:t xml:space="preserve"> </w:t>
+      </w:r>
+      <w:r>
+        <w:t xml:space="preserve">counts the strata that hold exactly one plot,</w:t>
+      </w:r>
+      <w:r>
+        <w:t xml:space="preserve"> </w:t>
+      </w:r>
+      <w:r>
+        <w:t xml:space="preserve">so the single-plot branch ran whenever any stratum held one plot,</w:t>
+      </w:r>
+      <w:r>
+        <w:t xml:space="preserve"> </w:t>
+      </w:r>
+      <w:r>
+        <w:t xml:space="preserve">not only when the whole result was one plot.</w:t>
+      </w:r>
+      <w:r>
+        <w:t xml:space="preserve"> </w:t>
+      </w:r>
+      <w:r>
+        <w:t xml:space="preserve">Splitting the condition into named steps makes the author say what each step should mean (</w:t>
+      </w:r>
+      <w:r>
+        <w:rPr>
+          <w:rStyle w:val="VerbatimChar"/>
+        </w:rPr>
+        <w:t xml:space="preserve">n_plots</w:t>
+      </w:r>
+      <w:r>
+        <w:t xml:space="preserve">, then</w:t>
+      </w:r>
+      <w:r>
+        <w:t xml:space="preserve"> </w:t>
+      </w:r>
+      <w:r>
+        <w:rPr>
+          <w:rStyle w:val="VerbatimChar"/>
+        </w:rPr>
+        <w:t xml:space="preserve">single_plot</w:t>
+      </w:r>
+      <w:r>
+        <w:t xml:space="preserve">),</w:t>
+      </w:r>
+      <w:r>
+        <w:t xml:space="preserve"> </w:t>
+      </w:r>
+      <w:r>
+        <w:t xml:space="preserve">which puts the comparison on its own line where a misplaced parenthesis is visible in review,</w:t>
+      </w:r>
+      <w:r>
+        <w:t xml:space="preserve"> </w:t>
+      </w:r>
+      <w:r>
+        <w:t xml:space="preserve">and the named value can be inspected in a debugger before the branch runs.</w:t>
+      </w:r>
+    </w:p>
+    <w:bookmarkEnd w:id="39"/>
+    <w:bookmarkStart w:id="41" w:name="Xe498262ae6be61f401e18dbcc7cafd360e15ce1"/>
+    <w:p>
+      <w:pPr>
+        <w:pStyle w:val="Heading3"/>
+      </w:pPr>
+      <w:r>
+        <w:t xml:space="preserve">5.2 Prefer more, simpler steps over fewer, denser ones</w:t>
       </w:r>
     </w:p>
     <w:p>
@@ -4050,7 +4767,7 @@
       <w:r>
         <w:t xml:space="preserve"> </w:t>
       </w:r>
-      <w:hyperlink r:id="rId37">
+      <w:hyperlink r:id="rId40">
         <w:r>
           <w:rPr>
             <w:rStyle w:val="Hyperlink"/>
@@ -4192,14 +4909,14 @@
         <w:t xml:space="preserve">which is a claim to settle with performance benchmarking, not by assumption.</w:t>
       </w:r>
     </w:p>
-    <w:bookmarkEnd w:id="38"/>
-    <w:bookmarkStart w:id="39" w:name="lambdas-in-map-and-apply-family-calls"/>
+    <w:bookmarkEnd w:id="41"/>
+    <w:bookmarkStart w:id="42" w:name="lambdas-in-map-and-apply-family-calls"/>
     <w:p>
       <w:pPr>
         <w:pStyle w:val="Heading3"/>
       </w:pPr>
       <w:r>
-        <w:t xml:space="preserve">5.2 Lambdas in map() and apply-family calls</w:t>
+        <w:t xml:space="preserve">5.3 Lambdas in map() and apply-family calls</w:t>
       </w:r>
     </w:p>
     <w:p>
@@ -4666,9 +5383,9 @@
         <w:t xml:space="preserve">that is the same closure escape hatch as the nested-definition rule above.</w:t>
       </w:r>
     </w:p>
-    <w:bookmarkEnd w:id="39"/>
-    <w:bookmarkEnd w:id="40"/>
-    <w:bookmarkStart w:id="41" w:name="sec-prefer-packaged-functions"/>
+    <w:bookmarkEnd w:id="42"/>
+    <w:bookmarkEnd w:id="43"/>
+    <w:bookmarkStart w:id="44" w:name="sec-prefer-packaged-functions"/>
     <w:p>
       <w:pPr>
         <w:pStyle w:val="Heading2"/>
@@ -4984,8 +5701,8 @@
         <w:t xml:space="preserve">verify a self-imposed constraint and report that as having justified the hand-rolled version.</w:t>
       </w:r>
     </w:p>
-    <w:bookmarkEnd w:id="41"/>
-    <w:bookmarkStart w:id="43" w:name="sec-per-operation-grouping"/>
+    <w:bookmarkEnd w:id="44"/>
+    <w:bookmarkStart w:id="46" w:name="sec-per-operation-grouping"/>
     <w:p>
       <w:pPr>
         <w:pStyle w:val="Heading2"/>
@@ -5291,7 +6008,7 @@
       <w:r>
         <w:t xml:space="preserve"> </w:t>
       </w:r>
-      <w:hyperlink r:id="rId42">
+      <w:hyperlink r:id="rId45">
         <w:r>
           <w:rPr>
             <w:rStyle w:val="Hyperlink"/>
@@ -5350,8 +6067,8 @@
         <w:t xml:space="preserve">and no subsequent operation needs it to persist.</w:t>
       </w:r>
     </w:p>
-    <w:bookmarkEnd w:id="43"/>
-    <w:bookmarkStart w:id="48" w:name="sec-avoid-hardcoding-external-data"/>
+    <w:bookmarkEnd w:id="46"/>
+    <w:bookmarkStart w:id="51" w:name="sec-avoid-hardcoding-external-data"/>
     <w:p>
       <w:pPr>
         <w:pStyle w:val="Heading2"/>
@@ -5518,7 +6235,7 @@
         <w:t xml:space="preserve">rather than trusting two hand-edited copies to stay in sync.</w:t>
       </w:r>
     </w:p>
-    <w:bookmarkStart w:id="46" w:name="X6cd99ac23357f519341a53b23e138c646ea1c45"/>
+    <w:bookmarkStart w:id="49" w:name="X6cd99ac23357f519341a53b23e138c646ea1c45"/>
     <w:p>
       <w:pPr>
         <w:pStyle w:val="Heading3"/>
@@ -6032,7 +6749,7 @@
         <w:t xml:space="preserve">that is the bug this guidance prevents.</w:t>
       </w:r>
     </w:p>
-    <w:bookmarkStart w:id="44" w:name="X45da8616c13d9849c5079b09e6f10b14b1e8a62"/>
+    <w:bookmarkStart w:id="47" w:name="X45da8616c13d9849c5079b09e6f10b14b1e8a62"/>
     <w:p>
       <w:pPr>
         <w:pStyle w:val="Heading4"/>
@@ -6451,8 +7168,8 @@
         <w:t xml:space="preserve">read adjacency as protection — the nearest duplicate is the one your own edit falsifies first.</w:t>
       </w:r>
     </w:p>
-    <w:bookmarkEnd w:id="44"/>
-    <w:bookmarkStart w:id="45" w:name="X72c8559fef7141ca39114dc26401b510adc0c7e"/>
+    <w:bookmarkEnd w:id="47"/>
+    <w:bookmarkStart w:id="48" w:name="X72c8559fef7141ca39114dc26401b510adc0c7e"/>
     <w:p>
       <w:pPr>
         <w:pStyle w:val="Heading4"/>
@@ -6732,9 +7449,9 @@
         <w:t xml:space="preserve">assume a qualitative lead-in is safe because it carries no number that could go stale.</w:t>
       </w:r>
     </w:p>
-    <w:bookmarkEnd w:id="45"/>
-    <w:bookmarkEnd w:id="46"/>
-    <w:bookmarkStart w:id="47" w:name="X4e174cb9149f2b2e14b36b2edf87964fcbfdad4"/>
+    <w:bookmarkEnd w:id="48"/>
+    <w:bookmarkEnd w:id="49"/>
+    <w:bookmarkStart w:id="50" w:name="X4e174cb9149f2b2e14b36b2edf87964fcbfdad4"/>
     <w:p>
       <w:pPr>
         <w:pStyle w:val="Heading3"/>
@@ -7089,9 +7806,9 @@
         <w:t xml:space="preserve">there it is the evidence.</w:t>
       </w:r>
     </w:p>
-    <w:bookmarkEnd w:id="47"/>
-    <w:bookmarkEnd w:id="48"/>
-    <w:bookmarkStart w:id="49" w:name="sec-construct-inputs"/>
+    <w:bookmarkEnd w:id="50"/>
+    <w:bookmarkEnd w:id="51"/>
+    <w:bookmarkStart w:id="52" w:name="sec-construct-inputs"/>
     <w:p>
       <w:pPr>
         <w:pStyle w:val="Heading2"/>
@@ -7679,8 +8396,8 @@
         <w:t xml:space="preserve">prefer named steps you can read and check over one dense expression.</w:t>
       </w:r>
     </w:p>
-    <w:bookmarkEnd w:id="49"/>
-    <w:bookmarkStart w:id="55" w:name="sec-comments"/>
+    <w:bookmarkEnd w:id="52"/>
+    <w:bookmarkStart w:id="58" w:name="sec-comments"/>
     <w:p>
       <w:pPr>
         <w:pStyle w:val="Heading2"/>
@@ -8088,7 +8805,7 @@
       <w:r>
         <w:t xml:space="preserve"> </w:t>
       </w:r>
-      <w:hyperlink r:id="rId50">
+      <w:hyperlink r:id="rId53">
         <w:r>
           <w:rPr>
             <w:rStyle w:val="Hyperlink"/>
@@ -8156,18 +8873,18 @@
                 <wp:inline>
                   <wp:extent cx="152400" cy="152400"/>
                   <wp:effectExtent b="0" l="0" r="0" t="0"/>
-                  <wp:docPr descr="" title="" id="52" name="Picture"/>
+                  <wp:docPr descr="" title="" id="55" name="Picture"/>
                   <a:graphic>
                     <a:graphicData uri="http://schemas.openxmlformats.org/drawingml/2006/picture">
                       <pic:pic>
                         <pic:nvPicPr>
-                          <pic:cNvPr descr="/opt/quarto/share/formats/docx/note.png" id="53" name="Picture"/>
+                          <pic:cNvPr descr="/opt/quarto/share/formats/docx/note.png" id="56" name="Picture"/>
                           <pic:cNvPicPr>
                             <a:picLocks noChangeArrowheads="1" noChangeAspect="1"/>
                           </pic:cNvPicPr>
                         </pic:nvPicPr>
                         <pic:blipFill>
-                          <a:blip r:embed="rId51"/>
+                          <a:blip r:embed="rId54"/>
                           <a:stretch>
                             <a:fillRect/>
                           </a:stretch>
@@ -8269,7 +8986,7 @@
       <w:r>
         <w:t xml:space="preserve"> </w:t>
       </w:r>
-      <w:hyperlink r:id="rId54">
+      <w:hyperlink r:id="rId57">
         <w:r>
           <w:rPr>
             <w:rStyle w:val="Hyperlink"/>
@@ -8398,8 +9115,8 @@
         <w:t xml:space="preserve">You can configure RStudio’s settings to display the 80-character margin.</w:t>
       </w:r>
     </w:p>
-    <w:bookmarkEnd w:id="55"/>
-    <w:bookmarkStart w:id="60" w:name="sec-line-breaks-and-formatting"/>
+    <w:bookmarkEnd w:id="58"/>
+    <w:bookmarkStart w:id="63" w:name="sec-line-breaks-and-formatting"/>
     <w:p>
       <w:pPr>
         <w:pStyle w:val="Heading2"/>
@@ -8408,7 +9125,7 @@
         <w:t xml:space="preserve">11 Line Breaks and Formatting</w:t>
       </w:r>
     </w:p>
-    <w:bookmarkStart w:id="56" w:name="blank-lines-before-lists"/>
+    <w:bookmarkStart w:id="59" w:name="blank-lines-before-lists"/>
     <w:p>
       <w:pPr>
         <w:pStyle w:val="Heading3"/>
@@ -8562,8 +9279,8 @@
         <w:t xml:space="preserve">- Second item</w:t>
       </w:r>
     </w:p>
-    <w:bookmarkEnd w:id="56"/>
-    <w:bookmarkStart w:id="58" w:name="sec-semantic-line-breaks"/>
+    <w:bookmarkEnd w:id="59"/>
+    <w:bookmarkStart w:id="61" w:name="sec-semantic-line-breaks"/>
     <w:p>
       <w:pPr>
         <w:pStyle w:val="Heading3"/>
@@ -8784,7 +9501,7 @@
       <w:r>
         <w:t xml:space="preserve"> </w:t>
       </w:r>
-      <w:hyperlink r:id="rId57">
+      <w:hyperlink r:id="rId60">
         <w:r>
           <w:rPr>
             <w:rStyle w:val="Hyperlink"/>
@@ -8868,8 +9585,8 @@
         <w:t xml:space="preserve">Do not break in the middle of inline code, links, or formatting</w:t>
       </w:r>
     </w:p>
-    <w:bookmarkEnd w:id="58"/>
-    <w:bookmarkStart w:id="59" w:name="line-breaks-in-code"/>
+    <w:bookmarkEnd w:id="61"/>
+    <w:bookmarkStart w:id="62" w:name="line-breaks-in-code"/>
     <w:p>
       <w:pPr>
         <w:pStyle w:val="Heading3"/>
@@ -10919,9 +11636,9 @@
         <w:t xml:space="preserve">call. Trying to fix bugs and ensure your code is working can be a nightmare. Now imagine trying to do it with the same code 6 months after you’ve written it. Invest the time now and reap the rewards as the code practically explains itself, line by line.</w:t>
       </w:r>
     </w:p>
-    <w:bookmarkEnd w:id="59"/>
-    <w:bookmarkEnd w:id="60"/>
-    <w:bookmarkStart w:id="63" w:name="sec-markdown-and-quarto-formatting"/>
+    <w:bookmarkEnd w:id="62"/>
+    <w:bookmarkEnd w:id="63"/>
+    <w:bookmarkStart w:id="66" w:name="sec-markdown-and-quarto-formatting"/>
     <w:p>
       <w:pPr>
         <w:pStyle w:val="Heading2"/>
@@ -10930,7 +11647,7 @@
         <w:t xml:space="preserve">12 Markdown and Quarto Formatting</w:t>
       </w:r>
     </w:p>
-    <w:bookmarkStart w:id="62" w:name="writing-about-code-in-quarto-documents"/>
+    <w:bookmarkStart w:id="65" w:name="writing-about-code-in-quarto-documents"/>
     <w:p>
       <w:pPr>
         <w:pStyle w:val="Heading3"/>
@@ -10991,7 +11708,7 @@
       <w:r>
         <w:t xml:space="preserve"> </w:t>
       </w:r>
-      <w:hyperlink r:id="rId61">
+      <w:hyperlink r:id="rId64">
         <w:r>
           <w:rPr>
             <w:rStyle w:val="VerbatimChar"/>
@@ -11051,9 +11768,9 @@
         <w:t xml:space="preserve">Always use Quarto/markdown link syntax instead.</w:t>
       </w:r>
     </w:p>
-    <w:bookmarkEnd w:id="62"/>
-    <w:bookmarkEnd w:id="63"/>
-    <w:bookmarkStart w:id="65" w:name="sec-messaging-and-user-communication"/>
+    <w:bookmarkEnd w:id="65"/>
+    <w:bookmarkEnd w:id="66"/>
+    <w:bookmarkStart w:id="68" w:name="sec-messaging-and-user-communication"/>
     <w:p>
       <w:pPr>
         <w:pStyle w:val="Heading2"/>
@@ -11553,7 +12270,7 @@
         <w:t xml:space="preserve">)</w:t>
       </w:r>
     </w:p>
-    <w:bookmarkStart w:id="64" w:name="sec-cli-styling-progress-outcomes"/>
+    <w:bookmarkStart w:id="67" w:name="sec-cli-styling-progress-outcomes"/>
     <w:p>
       <w:pPr>
         <w:pStyle w:val="Heading3"/>
@@ -12299,9 +13016,9 @@
         <w:t xml:space="preserve">)</w:t>
       </w:r>
     </w:p>
-    <w:bookmarkEnd w:id="64"/>
-    <w:bookmarkEnd w:id="65"/>
-    <w:bookmarkStart w:id="67" w:name="sec-package-code-practices"/>
+    <w:bookmarkEnd w:id="67"/>
+    <w:bookmarkEnd w:id="68"/>
+    <w:bookmarkStart w:id="70" w:name="sec-package-code-practices"/>
     <w:p>
       <w:pPr>
         <w:pStyle w:val="Heading2"/>
@@ -12516,7 +13233,7 @@
       <w:r>
         <w:t xml:space="preserve"> </w:t>
       </w:r>
-      <w:hyperlink r:id="rId66">
+      <w:hyperlink r:id="rId69">
         <w:r>
           <w:rPr>
             <w:rStyle w:val="Hyperlink"/>
@@ -12626,8 +13343,8 @@
         <w:t xml:space="preserve">: Extract repeated logic into helper functions</w:t>
       </w:r>
     </w:p>
-    <w:bookmarkEnd w:id="67"/>
-    <w:bookmarkStart w:id="69" w:name="sec-tidyverse-replacements"/>
+    <w:bookmarkEnd w:id="70"/>
+    <w:bookmarkStart w:id="72" w:name="sec-tidyverse-replacements"/>
     <w:p>
       <w:pPr>
         <w:pStyle w:val="Heading2"/>
@@ -13160,7 +13877,7 @@
       <w:r>
         <w:t xml:space="preserve"> </w:t>
       </w:r>
-      <w:hyperlink r:id="rId68">
+      <w:hyperlink r:id="rId71">
         <w:r>
           <w:rPr>
             <w:rStyle w:val="Hyperlink"/>
@@ -13172,8 +13889,8 @@
         <w:t xml:space="preserve">.</w:t>
       </w:r>
     </w:p>
-    <w:bookmarkEnd w:id="69"/>
-    <w:bookmarkStart w:id="73" w:name="sec-here-package-style"/>
+    <w:bookmarkEnd w:id="72"/>
+    <w:bookmarkStart w:id="76" w:name="sec-here-package-style"/>
     <w:p>
       <w:pPr>
         <w:pStyle w:val="Heading2"/>
@@ -13456,7 +14173,7 @@
       <w:r>
         <w:t xml:space="preserve"> </w:t>
       </w:r>
-      <w:hyperlink r:id="rId70">
+      <w:hyperlink r:id="rId73">
         <w:r>
           <w:rPr>
             <w:rStyle w:val="Hyperlink"/>
@@ -13468,7 +14185,7 @@
         <w:t xml:space="preserve">.</w:t>
       </w:r>
     </w:p>
-    <w:bookmarkStart w:id="72" w:name="sec-here-subpath"/>
+    <w:bookmarkStart w:id="75" w:name="sec-here-subpath"/>
     <w:p>
       <w:pPr>
         <w:pStyle w:val="Heading3"/>
@@ -13903,7 +14620,7 @@
         </w:rPr>
         <w:t xml:space="preserve"> </w:t>
       </w:r>
-      <w:hyperlink r:id="rId71">
+      <w:hyperlink r:id="rId74">
         <w:r>
           <w:rPr>
             <w:rStyle w:val="Hyperlink"/>
@@ -13928,9 +14645,9 @@
         <w:t xml:space="preserve">for detailed explanation of the here package.</w:t>
       </w:r>
     </w:p>
-    <w:bookmarkEnd w:id="72"/>
-    <w:bookmarkEnd w:id="73"/>
-    <w:bookmarkStart w:id="79" w:name="sec-object-naming"/>
+    <w:bookmarkEnd w:id="75"/>
+    <w:bookmarkEnd w:id="76"/>
+    <w:bookmarkStart w:id="82" w:name="sec-object-naming"/>
     <w:p>
       <w:pPr>
         <w:pStyle w:val="Heading2"/>
@@ -15087,18 +15804,18 @@
                 <wp:inline>
                   <wp:extent cx="152400" cy="152400"/>
                   <wp:effectExtent b="0" l="0" r="0" t="0"/>
-                  <wp:docPr descr="" title="" id="74" name="Picture"/>
+                  <wp:docPr descr="" title="" id="77" name="Picture"/>
                   <a:graphic>
                     <a:graphicData uri="http://schemas.openxmlformats.org/drawingml/2006/picture">
                       <pic:pic>
                         <pic:nvPicPr>
-                          <pic:cNvPr descr="/opt/quarto/share/formats/docx/note.png" id="75" name="Picture"/>
+                          <pic:cNvPr descr="/opt/quarto/share/formats/docx/note.png" id="78" name="Picture"/>
                           <pic:cNvPicPr>
                             <a:picLocks noChangeArrowheads="1" noChangeAspect="1"/>
                           </pic:cNvPicPr>
                         </pic:nvPicPr>
                         <pic:blipFill>
-                          <a:blip r:embed="rId51"/>
+                          <a:blip r:embed="rId54"/>
                           <a:stretch>
                             <a:fillRect/>
                           </a:stretch>
@@ -15260,18 +15977,18 @@
                 <wp:inline>
                   <wp:extent cx="152400" cy="152400"/>
                   <wp:effectExtent b="0" l="0" r="0" t="0"/>
-                  <wp:docPr descr="" title="" id="76" name="Picture"/>
+                  <wp:docPr descr="" title="" id="79" name="Picture"/>
                   <a:graphic>
                     <a:graphicData uri="http://schemas.openxmlformats.org/drawingml/2006/picture">
                       <pic:pic>
                         <pic:nvPicPr>
-                          <pic:cNvPr descr="/opt/quarto/share/formats/docx/note.png" id="77" name="Picture"/>
+                          <pic:cNvPr descr="/opt/quarto/share/formats/docx/note.png" id="80" name="Picture"/>
                           <pic:cNvPicPr>
                             <a:picLocks noChangeArrowheads="1" noChangeAspect="1"/>
                           </pic:cNvPicPr>
                         </pic:nvPicPr>
                         <pic:blipFill>
-                          <a:blip r:embed="rId51"/>
+                          <a:blip r:embed="rId54"/>
                           <a:stretch>
                             <a:fillRect/>
                           </a:stretch>
@@ -15379,7 +16096,7 @@
       <w:r>
         <w:t xml:space="preserve"> </w:t>
       </w:r>
-      <w:hyperlink r:id="rId78">
+      <w:hyperlink r:id="rId81">
         <w:r>
           <w:rPr>
             <w:rStyle w:val="Hyperlink"/>
@@ -15388,8 +16105,8 @@
         </w:r>
       </w:hyperlink>
     </w:p>
-    <w:bookmarkEnd w:id="79"/>
-    <w:bookmarkStart w:id="120" w:name="sec-style-auto-style"/>
+    <w:bookmarkEnd w:id="82"/>
+    <w:bookmarkStart w:id="123" w:name="sec-style-auto-style"/>
     <w:p>
       <w:pPr>
         <w:pStyle w:val="Heading2"/>
@@ -15398,7 +16115,7 @@
         <w:t xml:space="preserve">18 Automated Tools for Style and Project Workflow</w:t>
       </w:r>
     </w:p>
-    <w:bookmarkStart w:id="102" w:name="styling"/>
+    <w:bookmarkStart w:id="105" w:name="styling"/>
     <w:p>
       <w:pPr>
         <w:pStyle w:val="Heading3"/>
@@ -15407,7 +16124,7 @@
         <w:t xml:space="preserve">18.1 Styling</w:t>
       </w:r>
     </w:p>
-    <w:bookmarkStart w:id="81" w:name="rstudio-shortcuts"/>
+    <w:bookmarkStart w:id="84" w:name="rstudio-shortcuts"/>
     <w:p>
       <w:pPr>
         <w:pStyle w:val="Heading4"/>
@@ -15518,7 +16235,7 @@
       <w:r>
         <w:t xml:space="preserve"> </w:t>
       </w:r>
-      <w:hyperlink r:id="rId80">
+      <w:hyperlink r:id="rId83">
         <w:r>
           <w:rPr>
             <w:rStyle w:val="Hyperlink"/>
@@ -17691,13 +18408,13 @@
         <w:t xml:space="preserve">)</w:t>
       </w:r>
     </w:p>
-    <w:bookmarkEnd w:id="81"/>
-    <w:bookmarkStart w:id="93" w:name="styler"/>
+    <w:bookmarkEnd w:id="84"/>
+    <w:bookmarkStart w:id="96" w:name="styler"/>
     <w:p>
       <w:pPr>
         <w:pStyle w:val="Heading4"/>
       </w:pPr>
-      <w:hyperlink r:id="rId82">
+      <w:hyperlink r:id="rId85">
         <w:r>
           <w:rPr>
             <w:rStyle w:val="VerbatimChar"/>
@@ -17710,7 +18427,7 @@
       <w:pPr>
         <w:pStyle w:val="FirstParagraph"/>
       </w:pPr>
-      <w:hyperlink r:id="rId82">
+      <w:hyperlink r:id="rId85">
         <w:r>
           <w:rPr>
             <w:rStyle w:val="VerbatimChar"/>
@@ -17727,7 +18444,7 @@
       <w:r>
         <w:t xml:space="preserve"> </w:t>
       </w:r>
-      <w:hyperlink r:id="rId83">
+      <w:hyperlink r:id="rId86">
         <w:r>
           <w:rPr>
             <w:rStyle w:val="Hyperlink"/>
@@ -17759,7 +18476,7 @@
       <w:r>
         <w:t xml:space="preserve"> </w:t>
       </w:r>
-      <w:hyperlink r:id="rId84">
+      <w:hyperlink r:id="rId87">
         <w:r>
           <w:rPr>
             <w:rStyle w:val="Hyperlink"/>
@@ -17815,18 +18532,18 @@
                 <wp:inline>
                   <wp:extent cx="152400" cy="152400"/>
                   <wp:effectExtent b="0" l="0" r="0" t="0"/>
-                  <wp:docPr descr="" title="" id="85" name="Picture"/>
+                  <wp:docPr descr="" title="" id="88" name="Picture"/>
                   <a:graphic>
                     <a:graphicData uri="http://schemas.openxmlformats.org/drawingml/2006/picture">
                       <pic:pic>
                         <pic:nvPicPr>
-                          <pic:cNvPr descr="/opt/quarto/share/formats/docx/note.png" id="86" name="Picture"/>
+                          <pic:cNvPr descr="/opt/quarto/share/formats/docx/note.png" id="89" name="Picture"/>
                           <pic:cNvPicPr>
                             <a:picLocks noChangeArrowheads="1" noChangeAspect="1"/>
                           </pic:cNvPicPr>
                         </pic:nvPicPr>
                         <pic:blipFill>
-                          <a:blip r:embed="rId51"/>
+                          <a:blip r:embed="rId54"/>
                           <a:stretch>
                             <a:fillRect/>
                           </a:stretch>
@@ -17951,7 +18668,7 @@
             <w:r>
               <w:t xml:space="preserve"> </w:t>
             </w:r>
-            <w:hyperlink r:id="rId82">
+            <w:hyperlink r:id="rId85">
               <w:r>
                 <w:rPr>
                   <w:rStyle w:val="VerbatimChar"/>
@@ -17962,7 +18679,7 @@
             <w:r>
               <w:t xml:space="preserve"> </w:t>
             </w:r>
-            <w:hyperlink r:id="rId87">
+            <w:hyperlink r:id="rId90">
               <w:r>
                 <w:rPr>
                   <w:rStyle w:val="Hyperlink"/>
@@ -18030,18 +18747,18 @@
                 <wp:inline>
                   <wp:extent cx="152400" cy="152400"/>
                   <wp:effectExtent b="0" l="0" r="0" t="0"/>
-                  <wp:docPr descr="" title="" id="88" name="Picture"/>
+                  <wp:docPr descr="" title="" id="91" name="Picture"/>
                   <a:graphic>
                     <a:graphicData uri="http://schemas.openxmlformats.org/drawingml/2006/picture">
                       <pic:pic>
                         <pic:nvPicPr>
-                          <pic:cNvPr descr="/opt/quarto/share/formats/docx/note.png" id="89" name="Picture"/>
+                          <pic:cNvPr descr="/opt/quarto/share/formats/docx/note.png" id="92" name="Picture"/>
                           <pic:cNvPicPr>
                             <a:picLocks noChangeArrowheads="1" noChangeAspect="1"/>
                           </pic:cNvPicPr>
                         </pic:nvPicPr>
                         <pic:blipFill>
-                          <a:blip r:embed="rId51"/>
+                          <a:blip r:embed="rId54"/>
                           <a:stretch>
                             <a:fillRect/>
                           </a:stretch>
@@ -18103,7 +18820,7 @@
             <w:r>
               <w:t xml:space="preserve"> </w:t>
             </w:r>
-            <w:hyperlink r:id="rId82">
+            <w:hyperlink r:id="rId85">
               <w:r>
                 <w:rPr>
                   <w:rStyle w:val="VerbatimChar"/>
@@ -18221,18 +18938,18 @@
                 <wp:inline>
                   <wp:extent cx="152400" cy="152400"/>
                   <wp:effectExtent b="0" l="0" r="0" t="0"/>
-                  <wp:docPr descr="" title="" id="91" name="Picture"/>
+                  <wp:docPr descr="" title="" id="94" name="Picture"/>
                   <a:graphic>
                     <a:graphicData uri="http://schemas.openxmlformats.org/drawingml/2006/picture">
                       <pic:pic>
                         <pic:nvPicPr>
-                          <pic:cNvPr descr="/opt/quarto/share/formats/docx/tip.png" id="92" name="Picture"/>
+                          <pic:cNvPr descr="/opt/quarto/share/formats/docx/tip.png" id="95" name="Picture"/>
                           <pic:cNvPicPr>
                             <a:picLocks noChangeArrowheads="1" noChangeAspect="1"/>
                           </pic:cNvPicPr>
                         </pic:nvPicPr>
                         <pic:blipFill>
-                          <a:blip r:embed="rId90"/>
+                          <a:blip r:embed="rId93"/>
                           <a:stretch>
                             <a:fillRect/>
                           </a:stretch>
@@ -18445,13 +19162,13 @@
         </w:tc>
       </w:tr>
     </w:tbl>
-    <w:bookmarkEnd w:id="93"/>
-    <w:bookmarkStart w:id="101" w:name="lintr"/>
+    <w:bookmarkEnd w:id="96"/>
+    <w:bookmarkStart w:id="104" w:name="lintr"/>
     <w:p>
       <w:pPr>
         <w:pStyle w:val="Heading4"/>
       </w:pPr>
-      <w:hyperlink r:id="rId94">
+      <w:hyperlink r:id="rId97">
         <w:r>
           <w:rPr>
             <w:rStyle w:val="VerbatimChar"/>
@@ -18488,7 +19205,7 @@
       <w:r>
         <w:t xml:space="preserve"> </w:t>
       </w:r>
-      <w:hyperlink r:id="rId94">
+      <w:hyperlink r:id="rId97">
         <w:r>
           <w:rPr>
             <w:rStyle w:val="VerbatimChar"/>
@@ -18538,7 +19255,7 @@
       <w:r>
         <w:t xml:space="preserve"> </w:t>
       </w:r>
-      <w:hyperlink r:id="rId95">
+      <w:hyperlink r:id="rId98">
         <w:r>
           <w:rPr>
             <w:rStyle w:val="Hyperlink"/>
@@ -18611,18 +19328,18 @@
                 <wp:inline>
                   <wp:extent cx="152400" cy="152400"/>
                   <wp:effectExtent b="0" l="0" r="0" t="0"/>
-                  <wp:docPr descr="" title="" id="96" name="Picture"/>
+                  <wp:docPr descr="" title="" id="99" name="Picture"/>
                   <a:graphic>
                     <a:graphicData uri="http://schemas.openxmlformats.org/drawingml/2006/picture">
                       <pic:pic>
                         <pic:nvPicPr>
-                          <pic:cNvPr descr="/opt/quarto/share/formats/docx/note.png" id="97" name="Picture"/>
+                          <pic:cNvPr descr="/opt/quarto/share/formats/docx/note.png" id="100" name="Picture"/>
                           <pic:cNvPicPr>
                             <a:picLocks noChangeArrowheads="1" noChangeAspect="1"/>
                           </pic:cNvPicPr>
                         </pic:nvPicPr>
                         <pic:blipFill>
-                          <a:blip r:embed="rId51"/>
+                          <a:blip r:embed="rId54"/>
                           <a:stretch>
                             <a:fillRect/>
                           </a:stretch>
@@ -18690,7 +19407,7 @@
             <w:r>
               <w:t xml:space="preserve"> </w:t>
             </w:r>
-            <w:hyperlink r:id="rId98">
+            <w:hyperlink r:id="rId101">
               <w:r>
                 <w:rPr>
                   <w:rStyle w:val="Hyperlink"/>
@@ -18755,18 +19472,18 @@
                 <wp:inline>
                   <wp:extent cx="152400" cy="152400"/>
                   <wp:effectExtent b="0" l="0" r="0" t="0"/>
-                  <wp:docPr descr="" title="" id="99" name="Picture"/>
+                  <wp:docPr descr="" title="" id="102" name="Picture"/>
                   <a:graphic>
                     <a:graphicData uri="http://schemas.openxmlformats.org/drawingml/2006/picture">
                       <pic:pic>
                         <pic:nvPicPr>
-                          <pic:cNvPr descr="/opt/quarto/share/formats/docx/note.png" id="100" name="Picture"/>
+                          <pic:cNvPr descr="/opt/quarto/share/formats/docx/note.png" id="103" name="Picture"/>
                           <pic:cNvPicPr>
                             <a:picLocks noChangeArrowheads="1" noChangeAspect="1"/>
                           </pic:cNvPicPr>
                         </pic:nvPicPr>
                         <pic:blipFill>
-                          <a:blip r:embed="rId51"/>
+                          <a:blip r:embed="rId54"/>
                           <a:stretch>
                             <a:fillRect/>
                           </a:stretch>
@@ -18866,9 +19583,9 @@
         </w:tc>
       </w:tr>
     </w:tbl>
-    <w:bookmarkEnd w:id="101"/>
-    <w:bookmarkEnd w:id="102"/>
-    <w:bookmarkStart w:id="106" w:name="using-lintr"/>
+    <w:bookmarkEnd w:id="104"/>
+    <w:bookmarkEnd w:id="105"/>
+    <w:bookmarkStart w:id="109" w:name="using-lintr"/>
     <w:p>
       <w:pPr>
         <w:pStyle w:val="Heading3"/>
@@ -18918,18 +19635,18 @@
                 <wp:inline>
                   <wp:extent cx="152400" cy="152400"/>
                   <wp:effectExtent b="0" l="0" r="0" t="0"/>
-                  <wp:docPr descr="" title="" id="103" name="Picture"/>
+                  <wp:docPr descr="" title="" id="106" name="Picture"/>
                   <a:graphic>
                     <a:graphicData uri="http://schemas.openxmlformats.org/drawingml/2006/picture">
                       <pic:pic>
                         <pic:nvPicPr>
-                          <pic:cNvPr descr="/opt/quarto/share/formats/docx/tip.png" id="104" name="Picture"/>
+                          <pic:cNvPr descr="/opt/quarto/share/formats/docx/tip.png" id="107" name="Picture"/>
                           <pic:cNvPicPr>
                             <a:picLocks noChangeArrowheads="1" noChangeAspect="1"/>
                           </pic:cNvPicPr>
                         </pic:nvPicPr>
                         <pic:blipFill>
-                          <a:blip r:embed="rId90"/>
+                          <a:blip r:embed="rId93"/>
                           <a:stretch>
                             <a:fillRect/>
                           </a:stretch>
@@ -19358,7 +20075,7 @@
             <w:r>
               <w:t xml:space="preserve"> </w:t>
             </w:r>
-            <w:hyperlink r:id="rId105">
+            <w:hyperlink r:id="rId108">
               <w:r>
                 <w:rPr>
                   <w:rStyle w:val="VerbatimChar"/>
@@ -19478,8 +20195,8 @@
         </w:tc>
       </w:tr>
     </w:tbl>
-    <w:bookmarkEnd w:id="106"/>
-    <w:bookmarkStart w:id="117" w:name="our-labs-lintr-configuration"/>
+    <w:bookmarkEnd w:id="109"/>
+    <w:bookmarkStart w:id="120" w:name="our-labs-lintr-configuration"/>
     <w:p>
       <w:pPr>
         <w:pStyle w:val="Heading3"/>
@@ -19907,12 +20624,12 @@
         <w:t xml:space="preserve">: Undesirable function rules relaxed</w:t>
       </w:r>
     </w:p>
-    <w:bookmarkStart w:id="116" w:name="jarl"/>
+    <w:bookmarkStart w:id="119" w:name="jarl"/>
     <w:p>
       <w:pPr>
         <w:pStyle w:val="Heading4"/>
       </w:pPr>
-      <w:hyperlink r:id="rId107">
+      <w:hyperlink r:id="rId110">
         <w:r>
           <w:rPr>
             <w:rStyle w:val="VerbatimChar"/>
@@ -19925,7 +20642,7 @@
       <w:pPr>
         <w:pStyle w:val="FirstParagraph"/>
       </w:pPr>
-      <w:hyperlink r:id="rId107">
+      <w:hyperlink r:id="rId110">
         <w:r>
           <w:rPr>
             <w:rStyle w:val="VerbatimChar"/>
@@ -19975,7 +20692,7 @@
         <w:t xml:space="preserve">it performs static analysis significantly faster than standard R-based linters.</w:t>
       </w:r>
     </w:p>
-    <w:bookmarkStart w:id="110" w:name="key-features"/>
+    <w:bookmarkStart w:id="113" w:name="key-features"/>
     <w:p>
       <w:pPr>
         <w:pStyle w:val="Heading5"/>
@@ -20094,7 +20811,7 @@
       <w:r>
         <w:t xml:space="preserve"> </w:t>
       </w:r>
-      <w:hyperlink r:id="rId108">
+      <w:hyperlink r:id="rId111">
         <w:r>
           <w:rPr>
             <w:rStyle w:val="Hyperlink"/>
@@ -20164,7 +20881,7 @@
       <w:r>
         <w:t xml:space="preserve"> </w:t>
       </w:r>
-      <w:hyperlink r:id="rId109">
+      <w:hyperlink r:id="rId112">
         <w:r>
           <w:rPr>
             <w:rStyle w:val="VerbatimChar"/>
@@ -20179,8 +20896,8 @@
         <w:t xml:space="preserve">file in the project root.</w:t>
       </w:r>
     </w:p>
-    <w:bookmarkEnd w:id="110"/>
-    <w:bookmarkStart w:id="112" w:name="basic-usage"/>
+    <w:bookmarkEnd w:id="113"/>
+    <w:bookmarkStart w:id="115" w:name="basic-usage"/>
     <w:p>
       <w:pPr>
         <w:pStyle w:val="Heading5"/>
@@ -20199,7 +20916,7 @@
       <w:r>
         <w:t xml:space="preserve"> </w:t>
       </w:r>
-      <w:hyperlink r:id="rId111">
+      <w:hyperlink r:id="rId114">
         <w:r>
           <w:rPr>
             <w:rStyle w:val="Hyperlink"/>
@@ -20270,8 +20987,8 @@
         <w:t xml:space="preserve">--fix</w:t>
       </w:r>
     </w:p>
-    <w:bookmarkEnd w:id="112"/>
-    <w:bookmarkStart w:id="115" w:name="comparison-with-lintr"/>
+    <w:bookmarkEnd w:id="115"/>
+    <w:bookmarkStart w:id="118" w:name="comparison-with-lintr"/>
     <w:p>
       <w:pPr>
         <w:pStyle w:val="Heading5"/>
@@ -20490,7 +21207,7 @@
             <w:r>
               <w:t xml:space="preserve"> </w:t>
             </w:r>
-            <w:hyperlink r:id="rId105">
+            <w:hyperlink r:id="rId108">
               <w:r>
                 <w:rPr>
                   <w:rStyle w:val="VerbatimChar"/>
@@ -20604,18 +21321,18 @@
                 <wp:inline>
                   <wp:extent cx="152400" cy="152400"/>
                   <wp:effectExtent b="0" l="0" r="0" t="0"/>
-                  <wp:docPr descr="" title="" id="113" name="Picture"/>
+                  <wp:docPr descr="" title="" id="116" name="Picture"/>
                   <a:graphic>
                     <a:graphicData uri="http://schemas.openxmlformats.org/drawingml/2006/picture">
                       <pic:pic>
                         <pic:nvPicPr>
-                          <pic:cNvPr descr="/opt/quarto/share/formats/docx/note.png" id="114" name="Picture"/>
+                          <pic:cNvPr descr="/opt/quarto/share/formats/docx/note.png" id="117" name="Picture"/>
                           <pic:cNvPicPr>
                             <a:picLocks noChangeArrowheads="1" noChangeAspect="1"/>
                           </pic:cNvPicPr>
                         </pic:nvPicPr>
                         <pic:blipFill>
-                          <a:blip r:embed="rId51"/>
+                          <a:blip r:embed="rId54"/>
                           <a:stretch>
                             <a:fillRect/>
                           </a:stretch>
@@ -20677,7 +21394,7 @@
             <w:r>
               <w:t xml:space="preserve"> </w:t>
             </w:r>
-            <w:hyperlink r:id="rId94">
+            <w:hyperlink r:id="rId97">
               <w:r>
                 <w:rPr>
                   <w:rStyle w:val="VerbatimChar"/>
@@ -20711,7 +21428,7 @@
             <w:r>
               <w:t xml:space="preserve"> </w:t>
             </w:r>
-            <w:hyperlink r:id="rId105">
+            <w:hyperlink r:id="rId108">
               <w:r>
                 <w:rPr>
                   <w:rStyle w:val="VerbatimChar"/>
@@ -20751,10 +21468,10 @@
         </w:tc>
       </w:tr>
     </w:tbl>
-    <w:bookmarkEnd w:id="115"/>
-    <w:bookmarkEnd w:id="116"/>
-    <w:bookmarkEnd w:id="117"/>
-    <w:bookmarkStart w:id="119" w:name="X20514c3690be0e3afe0e3453b36bf4daf01ce44"/>
+    <w:bookmarkEnd w:id="118"/>
+    <w:bookmarkEnd w:id="119"/>
+    <w:bookmarkEnd w:id="120"/>
+    <w:bookmarkStart w:id="122" w:name="X20514c3690be0e3afe0e3453b36bf4daf01ce44"/>
     <w:p>
       <w:pPr>
         <w:pStyle w:val="Heading3"/>
@@ -20794,7 +21511,7 @@
       <w:r>
         <w:t xml:space="preserve"> </w:t>
       </w:r>
-      <w:hyperlink r:id="rId94">
+      <w:hyperlink r:id="rId97">
         <w:r>
           <w:rPr>
             <w:rStyle w:val="VerbatimChar"/>
@@ -20927,7 +21644,7 @@
       <w:r>
         <w:t xml:space="preserve"> </w:t>
       </w:r>
-      <w:hyperlink r:id="rId118">
+      <w:hyperlink r:id="rId121">
         <w:r>
           <w:rPr>
             <w:rStyle w:val="Hyperlink"/>
@@ -21007,9 +21724,9 @@
         <w:t xml:space="preserve">rather than as a side effect of someone else’s change.</w:t>
       </w:r>
     </w:p>
-    <w:bookmarkEnd w:id="119"/>
-    <w:bookmarkEnd w:id="120"/>
-    <w:bookmarkStart w:id="125" w:name="sec-r-resources-style"/>
+    <w:bookmarkEnd w:id="122"/>
+    <w:bookmarkEnd w:id="123"/>
+    <w:bookmarkStart w:id="128" w:name="sec-r-resources-style"/>
     <w:p>
       <w:pPr>
         <w:pStyle w:val="Heading2"/>
@@ -21039,8 +21756,8 @@
         <w:t xml:space="preserve">: Detailed coding style conventions for writing clear, consistent R code. Covers naming, syntax, pipes, functions, and more.</w:t>
       </w:r>
     </w:p>
-    <w:bookmarkStart w:id="124" w:name="refs"/>
-    <w:bookmarkStart w:id="121" w:name="ref-hunt1999pragmatic"/>
+    <w:bookmarkStart w:id="127" w:name="refs"/>
+    <w:bookmarkStart w:id="124" w:name="ref-hunt1999pragmatic"/>
     <w:p>
       <w:pPr>
         <w:pStyle w:val="Bibliography"/>
@@ -21062,8 +21779,8 @@
         <w:t xml:space="preserve">. Addison-Wesley.</w:t>
       </w:r>
     </w:p>
-    <w:bookmarkEnd w:id="121"/>
-    <w:bookmarkStart w:id="122" w:name="ref-martin2008cleancode"/>
+    <w:bookmarkEnd w:id="124"/>
+    <w:bookmarkStart w:id="125" w:name="ref-martin2008cleancode"/>
     <w:p>
       <w:pPr>
         <w:pStyle w:val="Bibliography"/>
@@ -21085,8 +21802,8 @@
         <w:t xml:space="preserve">. Prentice Hall.</w:t>
       </w:r>
     </w:p>
-    <w:bookmarkEnd w:id="122"/>
-    <w:bookmarkStart w:id="123" w:name="ref-wickham2023tidyverse"/>
+    <w:bookmarkEnd w:id="125"/>
+    <w:bookmarkStart w:id="126" w:name="ref-wickham2023tidyverse"/>
     <w:p>
       <w:pPr>
         <w:pStyle w:val="Bibliography"/>
@@ -21122,9 +21839,9 @@
         <w:t xml:space="preserve">.</w:t>
       </w:r>
     </w:p>
-    <w:bookmarkEnd w:id="123"/>
-    <w:bookmarkEnd w:id="124"/>
-    <w:bookmarkEnd w:id="125"/>
+    <w:bookmarkEnd w:id="126"/>
+    <w:bookmarkEnd w:id="127"/>
+    <w:bookmarkEnd w:id="128"/>
     <w:sectPr>
       <w:footnotePr>
         <w:numRestart w:val="eachSect"/>

</xml_diff>

<commit_message>
Deploying to gh-pages from @ Morrison-Lab/psc@48823b6ed399dd0c4c11bc749cd6ba78094bee30 🚀
</commit_message>
<xml_diff>
--- a/chapters/coding-style.docx
+++ b/chapters/coding-style.docx
@@ -15,7 +15,7 @@
         <w:pStyle w:val="Date"/>
       </w:pPr>
       <w:r>
-        <w:t xml:space="preserve">Last modified: 2026-10-12 02:20:54 (PDT)</w:t>
+        <w:t xml:space="preserve">Last modified: 2026-10-12 14:37:38 (PDT)</w:t>
       </w:r>
     </w:p>
     <w:p>
@@ -4007,7 +4007,13 @@
         <w:t xml:space="preserve"> </w:t>
       </w:r>
       <w:r>
-        <w:t xml:space="preserve">nor an argument the outer function captures and interprets itself:</w:t>
+        <w:t xml:space="preserve">nor an argument the outer function captures and interprets itself,</w:t>
+      </w:r>
+      <w:r>
+        <w:t xml:space="preserve"> </w:t>
+      </w:r>
+      <w:r>
+        <w:t xml:space="preserve">as in these examples, which are not a closed list:</w:t>
       </w:r>
       <w:r>
         <w:t xml:space="preserve"> </w:t>
@@ -4128,10 +4134,165 @@
       <w:r>
         <w:t xml:space="preserve">and pulling them out would break or obscure it.</w:t>
       </w:r>
-    </w:p>
-    <w:p>
-      <w:pPr>
-        <w:pStyle w:val="BodyText"/>
+      <w:r>
+        <w:t xml:space="preserve"> </w:t>
+      </w:r>
+      <w:r>
+        <w:t xml:space="preserve">The exemption stops at the captured argument itself.</w:t>
+      </w:r>
+      <w:r>
+        <w:t xml:space="preserve"> </w:t>
+      </w:r>
+      <w:r>
+        <w:t xml:space="preserve">In</w:t>
+      </w:r>
+      <w:r>
+        <w:t xml:space="preserve"> </w:t>
+      </w:r>
+      <w:r>
+        <w:rPr>
+          <w:rStyle w:val="VerbatimChar"/>
+        </w:rPr>
+        <w:t xml:space="preserve">select(df, all_of(names(x)))</w:t>
+      </w:r>
+      <w:r>
+        <w:t xml:space="preserve">,</w:t>
+      </w:r>
+      <w:r>
+        <w:t xml:space="preserve"> </w:t>
+      </w:r>
+      <w:r>
+        <w:rPr>
+          <w:rStyle w:val="VerbatimChar"/>
+        </w:rPr>
+        <w:t xml:space="preserve">select()</w:t>
+      </w:r>
+      <w:r>
+        <w:t xml:space="preserve"> </w:t>
+      </w:r>
+      <w:r>
+        <w:t xml:space="preserve">captures</w:t>
+      </w:r>
+      <w:r>
+        <w:t xml:space="preserve"> </w:t>
+      </w:r>
+      <w:r>
+        <w:rPr>
+          <w:rStyle w:val="VerbatimChar"/>
+        </w:rPr>
+        <w:t xml:space="preserve">all_of()</w:t>
+      </w:r>
+      <w:r>
+        <w:t xml:space="preserve">,</w:t>
+      </w:r>
+      <w:r>
+        <w:t xml:space="preserve"> </w:t>
+      </w:r>
+      <w:r>
+        <w:t xml:space="preserve">but</w:t>
+      </w:r>
+      <w:r>
+        <w:t xml:space="preserve"> </w:t>
+      </w:r>
+      <w:r>
+        <w:rPr>
+          <w:rStyle w:val="VerbatimChar"/>
+        </w:rPr>
+        <w:t xml:space="preserve">all_of()</w:t>
+      </w:r>
+      <w:r>
+        <w:t xml:space="preserve"> </w:t>
+      </w:r>
+      <w:r>
+        <w:t xml:space="preserve">evaluates</w:t>
+      </w:r>
+      <w:r>
+        <w:t xml:space="preserve"> </w:t>
+      </w:r>
+      <w:r>
+        <w:rPr>
+          <w:rStyle w:val="VerbatimChar"/>
+        </w:rPr>
+        <w:t xml:space="preserve">names(x)</w:t>
+      </w:r>
+      <w:r>
+        <w:t xml:space="preserve"> </w:t>
+      </w:r>
+      <w:r>
+        <w:t xml:space="preserve">as an ordinary value,</w:t>
+      </w:r>
+      <w:r>
+        <w:t xml:space="preserve"> </w:t>
+      </w:r>
+      <w:r>
+        <w:t xml:space="preserve">so that inner call still gets a name:</w:t>
+      </w:r>
+    </w:p>
+    <w:p>
+      <w:pPr>
+        <w:pStyle w:val="SourceCode"/>
+      </w:pPr>
+      <w:r>
+        <w:rPr>
+          <w:rStyle w:val="NormalTok"/>
+        </w:rPr>
+        <w:t xml:space="preserve">keep_cols </w:t>
+      </w:r>
+      <w:r>
+        <w:rPr>
+          <w:rStyle w:val="OtherTok"/>
+        </w:rPr>
+        <w:t xml:space="preserve">&lt;-</w:t>
+      </w:r>
+      <w:r>
+        <w:rPr>
+          <w:rStyle w:val="NormalTok"/>
+        </w:rPr>
+        <w:t xml:space="preserve"> </w:t>
+      </w:r>
+      <w:r>
+        <w:rPr>
+          <w:rStyle w:val="FunctionTok"/>
+        </w:rPr>
+        <w:t xml:space="preserve">names</w:t>
+      </w:r>
+      <w:r>
+        <w:rPr>
+          <w:rStyle w:val="NormalTok"/>
+        </w:rPr>
+        <w:t xml:space="preserve">(x)</w:t>
+      </w:r>
+      <w:r>
+        <w:br/>
+      </w:r>
+      <w:r>
+        <w:rPr>
+          <w:rStyle w:val="FunctionTok"/>
+        </w:rPr>
+        <w:t xml:space="preserve">select</w:t>
+      </w:r>
+      <w:r>
+        <w:rPr>
+          <w:rStyle w:val="NormalTok"/>
+        </w:rPr>
+        <w:t xml:space="preserve">(df, </w:t>
+      </w:r>
+      <w:r>
+        <w:rPr>
+          <w:rStyle w:val="FunctionTok"/>
+        </w:rPr>
+        <w:t xml:space="preserve">all_of</w:t>
+      </w:r>
+      <w:r>
+        <w:rPr>
+          <w:rStyle w:val="NormalTok"/>
+        </w:rPr>
+        <w:t xml:space="preserve">(keep_cols))</w:t>
+      </w:r>
+    </w:p>
+    <w:p>
+      <w:pPr>
+        <w:pStyle w:val="FirstParagraph"/>
       </w:pPr>
       <w:r>
         <w:t xml:space="preserve">The nested-definition rule is a readability and maintainability default, not an absolute rule —</w:t>
@@ -4265,7 +4426,13 @@
         <w:t xml:space="preserve"> </w:t>
       </w:r>
       <w:r>
-        <w:t xml:space="preserve">This holds even for a condition with no nested call, such as</w:t>
+        <w:t xml:space="preserve">This holds even for a condition with no nested call,</w:t>
+      </w:r>
+      <w:r>
+        <w:t xml:space="preserve"> </w:t>
+      </w:r>
+      <w:r>
+        <w:t xml:space="preserve">such as</w:t>
       </w:r>
       <w:r>
         <w:t xml:space="preserve"> </w:t>
@@ -4275,6 +4442,21 @@
           <w:rStyle w:val="VerbatimChar"/>
         </w:rPr>
         <w:t xml:space="preserve">is.na(strat)</w:t>
+      </w:r>
+      <w:r>
+        <w:t xml:space="preserve"> </w:t>
+      </w:r>
+      <w:r>
+        <w:t xml:space="preserve">or a single comparison like</w:t>
+      </w:r>
+      <w:r>
+        <w:t xml:space="preserve"> </w:t>
+      </w:r>
+      <w:r>
+        <w:rPr>
+          <w:rStyle w:val="VerbatimChar"/>
+        </w:rPr>
+        <w:t xml:space="preserve">x &gt; 0</w:t>
       </w:r>
       <w:r>
         <w:t xml:space="preserve">,</w:t>

</xml_diff>

<commit_message>
Deploying to gh-pages from @ Morrison-Lab/psc@d72512212eafcaf064cc305acfbba134f7cf858b 🚀
</commit_message>
<xml_diff>
--- a/chapters/coding-style.docx
+++ b/chapters/coding-style.docx
@@ -15,7 +15,7 @@
         <w:pStyle w:val="Date"/>
       </w:pPr>
       <w:r>
-        <w:t xml:space="preserve">Last modified: 2026-10-25 19:34:45 (PDT)</w:t>
+        <w:t xml:space="preserve">Last modified: 2026-10-25 19:40:13 (PDT)</w:t>
       </w:r>
     </w:p>
     <w:p>
@@ -14847,7 +14847,7 @@
     </w:p>
     <w:bookmarkEnd w:id="75"/>
     <w:bookmarkEnd w:id="76"/>
-    <w:bookmarkStart w:id="82" w:name="sec-object-naming"/>
+    <w:bookmarkStart w:id="85" w:name="sec-object-naming"/>
     <w:p>
       <w:pPr>
         <w:pStyle w:val="Heading2"/>
@@ -16291,12 +16291,467 @@
         <w:pStyle w:val="FirstParagraph"/>
       </w:pPr>
       <w:r>
+        <w:t xml:space="preserve">Give each object one lasting name.</w:t>
+      </w:r>
+      <w:r>
+        <w:t xml:space="preserve"> </w:t>
+      </w:r>
+      <w:r>
+        <w:t xml:space="preserve">Use an alias to shorten a name inside one piece of code,</w:t>
+      </w:r>
+      <w:r>
+        <w:t xml:space="preserve"> </w:t>
+      </w:r>
+      <w:r>
+        <w:t xml:space="preserve">but avoid creating a synonym.</w:t>
+      </w:r>
+      <w:r>
+        <w:t xml:space="preserve"> </w:t>
+      </w:r>
+      <w:hyperlink r:id="rId81">
+        <w:r>
+          <w:rPr>
+            <w:rStyle w:val="Hyperlink"/>
+          </w:rPr>
+          <w:t xml:space="preserve">GeeksforGeeks compares aliases and synonyms in SQL</w:t>
+        </w:r>
+      </w:hyperlink>
+      <w:r>
+        <w:t xml:space="preserve">:</w:t>
+      </w:r>
+    </w:p>
+    <w:p>
+      <w:pPr>
+        <w:pStyle w:val="Compact"/>
+        <w:numPr>
+          <w:ilvl w:val="0"/>
+          <w:numId w:val="1030"/>
+        </w:numPr>
+      </w:pPr>
+      <w:r>
+        <w:t xml:space="preserve">An</w:t>
+      </w:r>
+      <w:r>
+        <w:t xml:space="preserve"> </w:t>
+      </w:r>
+      <w:r>
+        <w:rPr>
+          <w:b/>
+          <w:bCs/>
+        </w:rPr>
+        <w:t xml:space="preserve">alias</w:t>
+      </w:r>
+      <w:r>
+        <w:t xml:space="preserve"> </w:t>
+      </w:r>
+      <w:r>
+        <w:t xml:space="preserve">is a second name that lasts only within one scope.</w:t>
+      </w:r>
+      <w:r>
+        <w:t xml:space="preserve"> </w:t>
+      </w:r>
+      <w:r>
+        <w:t xml:space="preserve">In SQL,</w:t>
+      </w:r>
+      <w:r>
+        <w:t xml:space="preserve"> </w:t>
+      </w:r>
+      <w:r>
+        <w:rPr>
+          <w:rStyle w:val="VerbatimChar"/>
+        </w:rPr>
+        <w:t xml:space="preserve">SELECT pat.id AS patient_id FROM patients pat</w:t>
+      </w:r>
+      <w:r>
+        <w:t xml:space="preserve"> </w:t>
+      </w:r>
+      <w:r>
+        <w:t xml:space="preserve">names the table</w:t>
+      </w:r>
+      <w:r>
+        <w:t xml:space="preserve"> </w:t>
+      </w:r>
+      <w:r>
+        <w:rPr>
+          <w:rStyle w:val="VerbatimChar"/>
+        </w:rPr>
+        <w:t xml:space="preserve">pat</w:t>
+      </w:r>
+      <w:r>
+        <w:t xml:space="preserve"> </w:t>
+      </w:r>
+      <w:r>
+        <w:t xml:space="preserve">and the column</w:t>
+      </w:r>
+      <w:r>
+        <w:t xml:space="preserve"> </w:t>
+      </w:r>
+      <w:r>
+        <w:rPr>
+          <w:rStyle w:val="VerbatimChar"/>
+        </w:rPr>
+        <w:t xml:space="preserve">patient_id</w:t>
+      </w:r>
+      <w:r>
+        <w:t xml:space="preserve"> </w:t>
+      </w:r>
+      <w:r>
+        <w:t xml:space="preserve">for that query only.</w:t>
+      </w:r>
+      <w:r>
+        <w:t xml:space="preserve"> </w:t>
+      </w:r>
+      <w:r>
+        <w:rPr>
+          <w:rStyle w:val="VerbatimChar"/>
+        </w:rPr>
+        <w:t xml:space="preserve">import pandas as pd</w:t>
+      </w:r>
+      <w:r>
+        <w:t xml:space="preserve"> </w:t>
+      </w:r>
+      <w:r>
+        <w:t xml:space="preserve">in Python names the module</w:t>
+      </w:r>
+      <w:r>
+        <w:t xml:space="preserve"> </w:t>
+      </w:r>
+      <w:r>
+        <w:rPr>
+          <w:rStyle w:val="VerbatimChar"/>
+        </w:rPr>
+        <w:t xml:space="preserve">pd</w:t>
+      </w:r>
+      <w:r>
+        <w:t xml:space="preserve"> </w:t>
+      </w:r>
+      <w:r>
+        <w:t xml:space="preserve">for one file.</w:t>
+      </w:r>
+    </w:p>
+    <w:p>
+      <w:pPr>
+        <w:pStyle w:val="Compact"/>
+        <w:numPr>
+          <w:ilvl w:val="0"/>
+          <w:numId w:val="1030"/>
+        </w:numPr>
+      </w:pPr>
+      <w:r>
+        <w:t xml:space="preserve">A</w:t>
+      </w:r>
+      <w:r>
+        <w:t xml:space="preserve"> </w:t>
+      </w:r>
+      <w:r>
+        <w:rPr>
+          <w:b/>
+          <w:bCs/>
+        </w:rPr>
+        <w:t xml:space="preserve">synonym</w:t>
+      </w:r>
+      <w:r>
+        <w:t xml:space="preserve"> </w:t>
+      </w:r>
+      <w:r>
+        <w:t xml:space="preserve">is a second name that is stored,</w:t>
+      </w:r>
+      <w:r>
+        <w:t xml:space="preserve"> </w:t>
+      </w:r>
+      <w:r>
+        <w:t xml:space="preserve">so it lasts until someone removes it.</w:t>
+      </w:r>
+      <w:r>
+        <w:t xml:space="preserve"> </w:t>
+      </w:r>
+      <w:r>
+        <w:t xml:space="preserve">Some databases, such as Oracle and SQL Server, provide</w:t>
+      </w:r>
+      <w:r>
+        <w:t xml:space="preserve"> </w:t>
+      </w:r>
+      <w:r>
+        <w:rPr>
+          <w:rStyle w:val="VerbatimChar"/>
+        </w:rPr>
+        <w:t xml:space="preserve">CREATE SYNONYM</w:t>
+      </w:r>
+      <w:r>
+        <w:t xml:space="preserve">,</w:t>
+      </w:r>
+      <w:r>
+        <w:t xml:space="preserve"> </w:t>
+      </w:r>
+      <w:r>
+        <w:t xml:space="preserve">which stores a name that points to another object</w:t>
+      </w:r>
+      <w:r>
+        <w:t xml:space="preserve"> </w:t>
+      </w:r>
+      <w:r>
+        <w:t xml:space="preserve">(</w:t>
+      </w:r>
+      <w:hyperlink r:id="rId82">
+        <w:r>
+          <w:rPr>
+            <w:rStyle w:val="Hyperlink"/>
+          </w:rPr>
+          <w:t xml:space="preserve">Oracle documentation</w:t>
+        </w:r>
+      </w:hyperlink>
+      <w:r>
+        <w:t xml:space="preserve">).</w:t>
+      </w:r>
+      <w:r>
+        <w:t xml:space="preserve"> </w:t>
+      </w:r>
+      <w:r>
+        <w:t xml:space="preserve">PostgreSQL and MySQL do not have this command.</w:t>
+      </w:r>
+    </w:p>
+    <w:p>
+      <w:pPr>
+        <w:pStyle w:val="FirstParagraph"/>
+      </w:pPr>
+      <w:r>
+        <w:t xml:space="preserve">Keep an alias recognizable, such as</w:t>
+      </w:r>
+      <w:r>
+        <w:t xml:space="preserve"> </w:t>
+      </w:r>
+      <w:r>
+        <w:rPr>
+          <w:rStyle w:val="VerbatimChar"/>
+        </w:rPr>
+        <w:t xml:space="preserve">pat</w:t>
+      </w:r>
+      <w:r>
+        <w:t xml:space="preserve"> </w:t>
+      </w:r>
+      <w:r>
+        <w:t xml:space="preserve">rather than</w:t>
+      </w:r>
+      <w:r>
+        <w:t xml:space="preserve"> </w:t>
+      </w:r>
+      <w:r>
+        <w:rPr>
+          <w:rStyle w:val="VerbatimChar"/>
+        </w:rPr>
+        <w:t xml:space="preserve">p</w:t>
+      </w:r>
+      <w:r>
+        <w:t xml:space="preserve">,</w:t>
+      </w:r>
+      <w:r>
+        <w:t xml:space="preserve"> </w:t>
+      </w:r>
+      <w:r>
+        <w:t xml:space="preserve">since the descriptive-name advice at the top of this section still applies.</w:t>
+      </w:r>
+      <w:r>
+        <w:t xml:space="preserve"> </w:t>
+      </w:r>
+      <w:r>
+        <w:t xml:space="preserve">A synonym in your own code makes readers look for a difference between the two names.</w:t>
+      </w:r>
+    </w:p>
+    <w:p>
+      <w:pPr>
+        <w:pStyle w:val="BodyText"/>
+      </w:pPr>
+      <w:r>
+        <w:t xml:space="preserve">An R package has one common exception.</w:t>
+      </w:r>
+      <w:r>
+        <w:t xml:space="preserve"> </w:t>
+      </w:r>
+      <w:r>
+        <w:t xml:space="preserve">When you rename an exported function,</w:t>
+      </w:r>
+      <w:r>
+        <w:t xml:space="preserve"> </w:t>
+      </w:r>
+      <w:r>
+        <w:t xml:space="preserve">keep the old name for a while as a wrapper so that existing code still runs,</w:t>
+      </w:r>
+      <w:r>
+        <w:t xml:space="preserve"> </w:t>
+      </w:r>
+      <w:r>
+        <w:t xml:space="preserve">and mark it as deprecated with</w:t>
+      </w:r>
+      <w:r>
+        <w:t xml:space="preserve"> </w:t>
+      </w:r>
+      <w:hyperlink r:id="rId83">
+        <w:r>
+          <w:rPr>
+            <w:rStyle w:val="VerbatimChar"/>
+          </w:rPr>
+          <w:t xml:space="preserve">{lifecycle}</w:t>
+        </w:r>
+      </w:hyperlink>
+      <w:r>
+        <w:t xml:space="preserve">:</w:t>
+      </w:r>
+    </w:p>
+    <w:p>
+      <w:pPr>
+        <w:pStyle w:val="SourceCode"/>
+      </w:pPr>
+      <w:r>
+        <w:rPr>
+          <w:rStyle w:val="CommentTok"/>
+        </w:rPr>
+        <w:t xml:space="preserve"># Keep the old name only as a deprecated wrapper</w:t>
+      </w:r>
+      <w:r>
+        <w:br/>
+      </w:r>
+      <w:r>
+        <w:rPr>
+          <w:rStyle w:val="NormalTok"/>
+        </w:rPr>
+        <w:t xml:space="preserve">prep_data </w:t>
+      </w:r>
+      <w:r>
+        <w:rPr>
+          <w:rStyle w:val="OtherTok"/>
+        </w:rPr>
+        <w:t xml:space="preserve">&lt;-</w:t>
+      </w:r>
+      <w:r>
+        <w:rPr>
+          <w:rStyle w:val="NormalTok"/>
+        </w:rPr>
+        <w:t xml:space="preserve"> </w:t>
+      </w:r>
+      <w:r>
+        <w:rPr>
+          <w:rStyle w:val="ControlFlowTok"/>
+        </w:rPr>
+        <w:t xml:space="preserve">function</w:t>
+      </w:r>
+      <w:r>
+        <w:rPr>
+          <w:rStyle w:val="NormalTok"/>
+        </w:rPr>
+        <w:t xml:space="preserve">(raw_data) {</w:t>
+      </w:r>
+      <w:r>
+        <w:br/>
+      </w:r>
+      <w:r>
+        <w:rPr>
+          <w:rStyle w:val="NormalTok"/>
+        </w:rPr>
+        <w:t xml:space="preserve">  lifecycle</w:t>
+      </w:r>
+      <w:r>
+        <w:rPr>
+          <w:rStyle w:val="SpecialCharTok"/>
+        </w:rPr>
+        <w:t xml:space="preserve">::</w:t>
+      </w:r>
+      <w:r>
+        <w:rPr>
+          <w:rStyle w:val="FunctionTok"/>
+        </w:rPr>
+        <w:t xml:space="preserve">deprecate_warn</w:t>
+      </w:r>
+      <w:r>
+        <w:rPr>
+          <w:rStyle w:val="NormalTok"/>
+        </w:rPr>
+        <w:t xml:space="preserve">(</w:t>
+      </w:r>
+      <w:r>
+        <w:rPr>
+          <w:rStyle w:val="StringTok"/>
+        </w:rPr>
+        <w:t xml:space="preserve">"1.2.0"</w:t>
+      </w:r>
+      <w:r>
+        <w:rPr>
+          <w:rStyle w:val="NormalTok"/>
+        </w:rPr>
+        <w:t xml:space="preserve">, </w:t>
+      </w:r>
+      <w:r>
+        <w:rPr>
+          <w:rStyle w:val="StringTok"/>
+        </w:rPr>
+        <w:t xml:space="preserve">"prep_data()"</w:t>
+      </w:r>
+      <w:r>
+        <w:rPr>
+          <w:rStyle w:val="NormalTok"/>
+        </w:rPr>
+        <w:t xml:space="preserve">, </w:t>
+      </w:r>
+      <w:r>
+        <w:rPr>
+          <w:rStyle w:val="StringTok"/>
+        </w:rPr>
+        <w:t xml:space="preserve">"prep_study_data()"</w:t>
+      </w:r>
+      <w:r>
+        <w:rPr>
+          <w:rStyle w:val="NormalTok"/>
+        </w:rPr>
+        <w:t xml:space="preserve">)</w:t>
+      </w:r>
+      <w:r>
+        <w:br/>
+      </w:r>
+      <w:r>
+        <w:rPr>
+          <w:rStyle w:val="NormalTok"/>
+        </w:rPr>
+        <w:t xml:space="preserve">  </w:t>
+      </w:r>
+      <w:r>
+        <w:rPr>
+          <w:rStyle w:val="FunctionTok"/>
+        </w:rPr>
+        <w:t xml:space="preserve">prep_study_data</w:t>
+      </w:r>
+      <w:r>
+        <w:rPr>
+          <w:rStyle w:val="NormalTok"/>
+        </w:rPr>
+        <w:t xml:space="preserve">(raw_data)</w:t>
+      </w:r>
+      <w:r>
+        <w:br/>
+      </w:r>
+      <w:r>
+        <w:rPr>
+          <w:rStyle w:val="NormalTok"/>
+        </w:rPr>
+        <w:t xml:space="preserve">}</w:t>
+      </w:r>
+    </w:p>
+    <w:p>
+      <w:r>
+        <w:pict>
+          <v:rect style="width:0;height:1.5pt" o:hralign="center" o:hrstd="t" o:hr="t"/>
+        </w:pict>
+      </w:r>
+    </w:p>
+    <w:p>
+      <w:pPr>
+        <w:pStyle w:val="FirstParagraph"/>
+      </w:pPr>
+      <w:r>
         <w:t xml:space="preserve">For more help, check out</w:t>
       </w:r>
       <w:r>
         <w:t xml:space="preserve"> </w:t>
       </w:r>
-      <w:hyperlink r:id="rId81">
+      <w:hyperlink r:id="rId84">
         <w:r>
           <w:rPr>
             <w:rStyle w:val="Hyperlink"/>
@@ -16305,8 +16760,8 @@
         </w:r>
       </w:hyperlink>
     </w:p>
-    <w:bookmarkEnd w:id="82"/>
-    <w:bookmarkStart w:id="123" w:name="sec-style-auto-style"/>
+    <w:bookmarkEnd w:id="85"/>
+    <w:bookmarkStart w:id="126" w:name="sec-style-auto-style"/>
     <w:p>
       <w:pPr>
         <w:pStyle w:val="Heading2"/>
@@ -16315,7 +16770,7 @@
         <w:t xml:space="preserve">18 Automated Tools for Style and Project Workflow</w:t>
       </w:r>
     </w:p>
-    <w:bookmarkStart w:id="105" w:name="styling"/>
+    <w:bookmarkStart w:id="108" w:name="styling"/>
     <w:p>
       <w:pPr>
         <w:pStyle w:val="Heading3"/>
@@ -16324,7 +16779,7 @@
         <w:t xml:space="preserve">18.1 Styling</w:t>
       </w:r>
     </w:p>
-    <w:bookmarkStart w:id="84" w:name="rstudio-shortcuts"/>
+    <w:bookmarkStart w:id="87" w:name="rstudio-shortcuts"/>
     <w:p>
       <w:pPr>
         <w:pStyle w:val="Heading4"/>
@@ -16337,7 +16792,7 @@
       <w:pPr>
         <w:numPr>
           <w:ilvl w:val="0"/>
-          <w:numId w:val="1030"/>
+          <w:numId w:val="1031"/>
         </w:numPr>
       </w:pPr>
       <w:r>
@@ -16416,7 +16871,7 @@
       <w:pPr>
         <w:numPr>
           <w:ilvl w:val="0"/>
-          <w:numId w:val="1030"/>
+          <w:numId w:val="1031"/>
         </w:numPr>
       </w:pPr>
       <w:r>
@@ -16435,7 +16890,7 @@
       <w:r>
         <w:t xml:space="preserve"> </w:t>
       </w:r>
-      <w:hyperlink r:id="rId83">
+      <w:hyperlink r:id="rId86">
         <w:r>
           <w:rPr>
             <w:rStyle w:val="Hyperlink"/>
@@ -18608,13 +19063,13 @@
         <w:t xml:space="preserve">)</w:t>
       </w:r>
     </w:p>
-    <w:bookmarkEnd w:id="84"/>
-    <w:bookmarkStart w:id="96" w:name="styler"/>
+    <w:bookmarkEnd w:id="87"/>
+    <w:bookmarkStart w:id="99" w:name="styler"/>
     <w:p>
       <w:pPr>
         <w:pStyle w:val="Heading4"/>
       </w:pPr>
-      <w:hyperlink r:id="rId85">
+      <w:hyperlink r:id="rId88">
         <w:r>
           <w:rPr>
             <w:rStyle w:val="VerbatimChar"/>
@@ -18627,7 +19082,7 @@
       <w:pPr>
         <w:pStyle w:val="FirstParagraph"/>
       </w:pPr>
-      <w:hyperlink r:id="rId85">
+      <w:hyperlink r:id="rId88">
         <w:r>
           <w:rPr>
             <w:rStyle w:val="VerbatimChar"/>
@@ -18644,7 +19099,7 @@
       <w:r>
         <w:t xml:space="preserve"> </w:t>
       </w:r>
-      <w:hyperlink r:id="rId86">
+      <w:hyperlink r:id="rId89">
         <w:r>
           <w:rPr>
             <w:rStyle w:val="Hyperlink"/>
@@ -18676,7 +19131,7 @@
       <w:r>
         <w:t xml:space="preserve"> </w:t>
       </w:r>
-      <w:hyperlink r:id="rId87">
+      <w:hyperlink r:id="rId90">
         <w:r>
           <w:rPr>
             <w:rStyle w:val="Hyperlink"/>
@@ -18689,221 +19144,6 @@
       </w:r>
       <w:r>
         <w:t xml:space="preserve">and the vignette linked above for more details.</w:t>
-      </w:r>
-    </w:p>
-    <w:tbl>
-      <w:tblPr>
-        <w:tblStyle w:val="Table"/>
-        <w:tblLook w:firstRow="0" w:lastRow="0" w:firstColumn="0" w:lastColumn="0" w:noHBand="0" w:noVBand="0" w:val="0000"/>
-        <w:tblBorders>
-          <w:top w:val="single" w:sz="4" w:space="0" w:color="0758E5"/>
-          <w:left w:val="single" w:sz="24" w:space="0" w:color="0758E5"/>
-          <w:bottom w:val="single" w:sz="4" w:space="0" w:color="0758E5"/>
-          <w:right w:val="single" w:sz="4" w:space="0" w:color="0758E5"/>
-        </w:tblBorders>
-        <w:tblCellMar>
-          <w:left w:w="144" w:type="dxa"/>
-          <w:right w:w="144" w:type="dxa"/>
-        </w:tblCellMar>
-        <w:tblLook w:firstRow="0" w:lastRow="0" w:firstColumn="0" w:lastColumn="0" w:noHBand="0" w:noVBand="0" w:val="0000"/>
-      </w:tblPr>
-      <w:tr>
-        <w:trPr>
-          <w:cantSplit/>
-        </w:trPr>
-        <w:tc>
-          <w:tcPr>
-            <w:shd w:color="auto" w:fill="dae6fb" w:val="clear"/>
-            <w:tcMar>
-              <w:top w:w="92" w:type="dxa"/>
-              <w:bottom w:w="92" w:type="dxa"/>
-            </w:tcMar>
-          </w:tcPr>
-          <w:p>
-            <w:pPr>
-              <w:pStyle w:val="BodyText"/>
-            </w:pPr>
-            <w:pPr>
-              <w:spacing w:before="0" w:after="0"/>
-              <w:textAlignment w:val="center"/>
-            </w:pPr>
-            <w:r>
-              <w:drawing>
-                <wp:inline>
-                  <wp:extent cx="152400" cy="152400"/>
-                  <wp:effectExtent b="0" l="0" r="0" t="0"/>
-                  <wp:docPr descr="" title="" id="88" name="Picture"/>
-                  <a:graphic>
-                    <a:graphicData uri="http://schemas.openxmlformats.org/drawingml/2006/picture">
-                      <pic:pic>
-                        <pic:nvPicPr>
-                          <pic:cNvPr descr="/opt/quarto/share/formats/docx/note.png" id="89" name="Picture"/>
-                          <pic:cNvPicPr>
-                            <a:picLocks noChangeArrowheads="1" noChangeAspect="1"/>
-                          </pic:cNvPicPr>
-                        </pic:nvPicPr>
-                        <pic:blipFill>
-                          <a:blip r:embed="rId54"/>
-                          <a:stretch>
-                            <a:fillRect/>
-                          </a:stretch>
-                        </pic:blipFill>
-                        <pic:spPr bwMode="auto">
-                          <a:xfrm>
-                            <a:off x="0" y="0"/>
-                            <a:ext cx="152400" cy="152400"/>
-                          </a:xfrm>
-                          <a:prstGeom prst="rect">
-                            <a:avLst/>
-                          </a:prstGeom>
-                          <a:noFill/>
-                          <a:ln w="9525">
-                            <a:noFill/>
-                            <a:headEnd/>
-                            <a:tailEnd/>
-                          </a:ln>
-                        </pic:spPr>
-                      </pic:pic>
-                    </a:graphicData>
-                  </a:graphic>
-                </wp:inline>
-              </w:drawing>
-            </w:r>
-            <w:r>
-              <w:t xml:space="preserve"> </w:t>
-            </w:r>
-            <w:r>
-              <w:t xml:space="preserve"> </w:t>
-            </w:r>
-            <w:r>
-              <w:t xml:space="preserve">Note</w:t>
-            </w:r>
-          </w:p>
-        </w:tc>
-      </w:tr>
-      <w:tr>
-        <w:trPr>
-          <w:cantSplit/>
-        </w:trPr>
-        <w:tc>
-          <w:tcPr>
-            <w:tcMar>
-              <w:top w:w="108" w:type="dxa"/>
-              <w:bottom w:w="108" w:type="dxa"/>
-            </w:tcMar>
-          </w:tcPr>
-          <w:p>
-            <w:pPr>
-              <w:pStyle w:val="BodyText"/>
-            </w:pPr>
-            <w:pPr>
-              <w:spacing w:before="16" w:after="16"/>
-            </w:pPr>
-            <w:r>
-              <w:t xml:space="preserve">The default Tidyverse styler is subtly different from some of the things we’ve advocated for in this document. Most notably we differ with regards to the assignment operator (</w:t>
-            </w:r>
-            <w:r>
-              <w:rPr>
-                <w:rStyle w:val="VerbatimChar"/>
-              </w:rPr>
-              <w:t xml:space="preserve">&lt;-</w:t>
-            </w:r>
-            <w:r>
-              <w:t xml:space="preserve"> </w:t>
-            </w:r>
-            <w:r>
-              <w:t xml:space="preserve">vs</w:t>
-            </w:r>
-            <w:r>
-              <w:t xml:space="preserve"> </w:t>
-            </w:r>
-            <w:r>
-              <w:rPr>
-                <w:rStyle w:val="VerbatimChar"/>
-              </w:rPr>
-              <w:t xml:space="preserve">=</w:t>
-            </w:r>
-            <w:r>
-              <w:t xml:space="preserve">) and number of spaces before/after</w:t>
-            </w:r>
-            <w:r>
-              <w:t xml:space="preserve"> </w:t>
-            </w:r>
-            <w:r>
-              <w:t xml:space="preserve">“tokens”</w:t>
-            </w:r>
-            <w:r>
-              <w:t xml:space="preserve"> </w:t>
-            </w:r>
-            <w:r>
-              <w:t xml:space="preserve">(i.e. Assignment Aligner add spaces before</w:t>
-            </w:r>
-            <w:r>
-              <w:t xml:space="preserve"> </w:t>
-            </w:r>
-            <w:r>
-              <w:rPr>
-                <w:rStyle w:val="VerbatimChar"/>
-              </w:rPr>
-              <w:t xml:space="preserve">=</w:t>
-            </w:r>
-            <w:r>
-              <w:t xml:space="preserve"> </w:t>
-            </w:r>
-            <w:r>
-              <w:t xml:space="preserve">signs to align them properly). For this reason, we’d recommend the following:</w:t>
-            </w:r>
-            <w:r>
-              <w:t xml:space="preserve"> </w:t>
-            </w:r>
-            <w:r>
-              <w:rPr>
-                <w:rStyle w:val="VerbatimChar"/>
-              </w:rPr>
-              <w:t xml:space="preserve">style_dir(path = ..., scope = "line_breaks", strict = FALSE)</w:t>
-            </w:r>
-            <w:r>
-              <w:t xml:space="preserve">. You can also customize</w:t>
-            </w:r>
-            <w:r>
-              <w:t xml:space="preserve"> </w:t>
-            </w:r>
-            <w:hyperlink r:id="rId85">
-              <w:r>
-                <w:rPr>
-                  <w:rStyle w:val="VerbatimChar"/>
-                </w:rPr>
-                <w:t xml:space="preserve">{styler}</w:t>
-              </w:r>
-            </w:hyperlink>
-            <w:r>
-              <w:t xml:space="preserve"> </w:t>
-            </w:r>
-            <w:hyperlink r:id="rId90">
-              <w:r>
-                <w:rPr>
-                  <w:rStyle w:val="Hyperlink"/>
-                </w:rPr>
-                <w:t xml:space="preserve">even more</w:t>
-              </w:r>
-            </w:hyperlink>
-            <w:r>
-              <w:t xml:space="preserve"> </w:t>
-            </w:r>
-            <w:r>
-              <w:t xml:space="preserve">if you’re really hardcore.</w:t>
-            </w:r>
-          </w:p>
-          <w:p/>
-        </w:tc>
-      </w:tr>
-    </w:tbl>
-    <w:p>
-      <w:pPr>
-        <w:pStyle w:val="BodyText"/>
-      </w:pPr>
-      <w:r>
-        <w:t xml:space="preserve"> </w:t>
       </w:r>
     </w:p>
     <w:tbl>
@@ -19015,12 +19255,227 @@
               <w:spacing w:before="16" w:after="16"/>
             </w:pPr>
             <w:r>
+              <w:t xml:space="preserve">The default Tidyverse styler is subtly different from some of the things we’ve advocated for in this document. Most notably we differ with regards to the assignment operator (</w:t>
+            </w:r>
+            <w:r>
+              <w:rPr>
+                <w:rStyle w:val="VerbatimChar"/>
+              </w:rPr>
+              <w:t xml:space="preserve">&lt;-</w:t>
+            </w:r>
+            <w:r>
+              <w:t xml:space="preserve"> </w:t>
+            </w:r>
+            <w:r>
+              <w:t xml:space="preserve">vs</w:t>
+            </w:r>
+            <w:r>
+              <w:t xml:space="preserve"> </w:t>
+            </w:r>
+            <w:r>
+              <w:rPr>
+                <w:rStyle w:val="VerbatimChar"/>
+              </w:rPr>
+              <w:t xml:space="preserve">=</w:t>
+            </w:r>
+            <w:r>
+              <w:t xml:space="preserve">) and number of spaces before/after</w:t>
+            </w:r>
+            <w:r>
+              <w:t xml:space="preserve"> </w:t>
+            </w:r>
+            <w:r>
+              <w:t xml:space="preserve">“tokens”</w:t>
+            </w:r>
+            <w:r>
+              <w:t xml:space="preserve"> </w:t>
+            </w:r>
+            <w:r>
+              <w:t xml:space="preserve">(i.e. Assignment Aligner add spaces before</w:t>
+            </w:r>
+            <w:r>
+              <w:t xml:space="preserve"> </w:t>
+            </w:r>
+            <w:r>
+              <w:rPr>
+                <w:rStyle w:val="VerbatimChar"/>
+              </w:rPr>
+              <w:t xml:space="preserve">=</w:t>
+            </w:r>
+            <w:r>
+              <w:t xml:space="preserve"> </w:t>
+            </w:r>
+            <w:r>
+              <w:t xml:space="preserve">signs to align them properly). For this reason, we’d recommend the following:</w:t>
+            </w:r>
+            <w:r>
+              <w:t xml:space="preserve"> </w:t>
+            </w:r>
+            <w:r>
+              <w:rPr>
+                <w:rStyle w:val="VerbatimChar"/>
+              </w:rPr>
+              <w:t xml:space="preserve">style_dir(path = ..., scope = "line_breaks", strict = FALSE)</w:t>
+            </w:r>
+            <w:r>
+              <w:t xml:space="preserve">. You can also customize</w:t>
+            </w:r>
+            <w:r>
+              <w:t xml:space="preserve"> </w:t>
+            </w:r>
+            <w:hyperlink r:id="rId88">
+              <w:r>
+                <w:rPr>
+                  <w:rStyle w:val="VerbatimChar"/>
+                </w:rPr>
+                <w:t xml:space="preserve">{styler}</w:t>
+              </w:r>
+            </w:hyperlink>
+            <w:r>
+              <w:t xml:space="preserve"> </w:t>
+            </w:r>
+            <w:hyperlink r:id="rId93">
+              <w:r>
+                <w:rPr>
+                  <w:rStyle w:val="Hyperlink"/>
+                </w:rPr>
+                <w:t xml:space="preserve">even more</w:t>
+              </w:r>
+            </w:hyperlink>
+            <w:r>
+              <w:t xml:space="preserve"> </w:t>
+            </w:r>
+            <w:r>
+              <w:t xml:space="preserve">if you’re really hardcore.</w:t>
+            </w:r>
+          </w:p>
+          <w:p/>
+        </w:tc>
+      </w:tr>
+    </w:tbl>
+    <w:p>
+      <w:pPr>
+        <w:pStyle w:val="BodyText"/>
+      </w:pPr>
+      <w:r>
+        <w:t xml:space="preserve"> </w:t>
+      </w:r>
+    </w:p>
+    <w:tbl>
+      <w:tblPr>
+        <w:tblStyle w:val="Table"/>
+        <w:tblLook w:firstRow="0" w:lastRow="0" w:firstColumn="0" w:lastColumn="0" w:noHBand="0" w:noVBand="0" w:val="0000"/>
+        <w:tblBorders>
+          <w:top w:val="single" w:sz="4" w:space="0" w:color="0758E5"/>
+          <w:left w:val="single" w:sz="24" w:space="0" w:color="0758E5"/>
+          <w:bottom w:val="single" w:sz="4" w:space="0" w:color="0758E5"/>
+          <w:right w:val="single" w:sz="4" w:space="0" w:color="0758E5"/>
+        </w:tblBorders>
+        <w:tblCellMar>
+          <w:left w:w="144" w:type="dxa"/>
+          <w:right w:w="144" w:type="dxa"/>
+        </w:tblCellMar>
+        <w:tblLook w:firstRow="0" w:lastRow="0" w:firstColumn="0" w:lastColumn="0" w:noHBand="0" w:noVBand="0" w:val="0000"/>
+      </w:tblPr>
+      <w:tr>
+        <w:trPr>
+          <w:cantSplit/>
+        </w:trPr>
+        <w:tc>
+          <w:tcPr>
+            <w:shd w:color="auto" w:fill="dae6fb" w:val="clear"/>
+            <w:tcMar>
+              <w:top w:w="92" w:type="dxa"/>
+              <w:bottom w:w="92" w:type="dxa"/>
+            </w:tcMar>
+          </w:tcPr>
+          <w:p>
+            <w:pPr>
+              <w:pStyle w:val="BodyText"/>
+            </w:pPr>
+            <w:pPr>
+              <w:spacing w:before="0" w:after="0"/>
+              <w:textAlignment w:val="center"/>
+            </w:pPr>
+            <w:r>
+              <w:drawing>
+                <wp:inline>
+                  <wp:extent cx="152400" cy="152400"/>
+                  <wp:effectExtent b="0" l="0" r="0" t="0"/>
+                  <wp:docPr descr="" title="" id="94" name="Picture"/>
+                  <a:graphic>
+                    <a:graphicData uri="http://schemas.openxmlformats.org/drawingml/2006/picture">
+                      <pic:pic>
+                        <pic:nvPicPr>
+                          <pic:cNvPr descr="/opt/quarto/share/formats/docx/note.png" id="95" name="Picture"/>
+                          <pic:cNvPicPr>
+                            <a:picLocks noChangeArrowheads="1" noChangeAspect="1"/>
+                          </pic:cNvPicPr>
+                        </pic:nvPicPr>
+                        <pic:blipFill>
+                          <a:blip r:embed="rId54"/>
+                          <a:stretch>
+                            <a:fillRect/>
+                          </a:stretch>
+                        </pic:blipFill>
+                        <pic:spPr bwMode="auto">
+                          <a:xfrm>
+                            <a:off x="0" y="0"/>
+                            <a:ext cx="152400" cy="152400"/>
+                          </a:xfrm>
+                          <a:prstGeom prst="rect">
+                            <a:avLst/>
+                          </a:prstGeom>
+                          <a:noFill/>
+                          <a:ln w="9525">
+                            <a:noFill/>
+                            <a:headEnd/>
+                            <a:tailEnd/>
+                          </a:ln>
+                        </pic:spPr>
+                      </pic:pic>
+                    </a:graphicData>
+                  </a:graphic>
+                </wp:inline>
+              </w:drawing>
+            </w:r>
+            <w:r>
+              <w:t xml:space="preserve"> </w:t>
+            </w:r>
+            <w:r>
+              <w:t xml:space="preserve"> </w:t>
+            </w:r>
+            <w:r>
+              <w:t xml:space="preserve">Note</w:t>
+            </w:r>
+          </w:p>
+        </w:tc>
+      </w:tr>
+      <w:tr>
+        <w:trPr>
+          <w:cantSplit/>
+        </w:trPr>
+        <w:tc>
+          <w:tcPr>
+            <w:tcMar>
+              <w:top w:w="108" w:type="dxa"/>
+              <w:bottom w:w="108" w:type="dxa"/>
+            </w:tcMar>
+          </w:tcPr>
+          <w:p>
+            <w:pPr>
+              <w:pStyle w:val="BodyText"/>
+            </w:pPr>
+            <w:pPr>
+              <w:spacing w:before="16" w:after="16"/>
+            </w:pPr>
+            <w:r>
               <w:t xml:space="preserve">As is mentioned in the package vignette linked above,</w:t>
             </w:r>
             <w:r>
               <w:t xml:space="preserve"> </w:t>
             </w:r>
-            <w:hyperlink r:id="rId85">
+            <w:hyperlink r:id="rId88">
               <w:r>
                 <w:rPr>
                   <w:rStyle w:val="VerbatimChar"/>
@@ -19138,18 +19593,18 @@
                 <wp:inline>
                   <wp:extent cx="152400" cy="152400"/>
                   <wp:effectExtent b="0" l="0" r="0" t="0"/>
-                  <wp:docPr descr="" title="" id="94" name="Picture"/>
+                  <wp:docPr descr="" title="" id="97" name="Picture"/>
                   <a:graphic>
                     <a:graphicData uri="http://schemas.openxmlformats.org/drawingml/2006/picture">
                       <pic:pic>
                         <pic:nvPicPr>
-                          <pic:cNvPr descr="/opt/quarto/share/formats/docx/tip.png" id="95" name="Picture"/>
+                          <pic:cNvPr descr="/opt/quarto/share/formats/docx/tip.png" id="98" name="Picture"/>
                           <pic:cNvPicPr>
                             <a:picLocks noChangeArrowheads="1" noChangeAspect="1"/>
                           </pic:cNvPicPr>
                         </pic:nvPicPr>
                         <pic:blipFill>
-                          <a:blip r:embed="rId93"/>
+                          <a:blip r:embed="rId96"/>
                           <a:stretch>
                             <a:fillRect/>
                           </a:stretch>
@@ -19362,13 +19817,13 @@
         </w:tc>
       </w:tr>
     </w:tbl>
-    <w:bookmarkEnd w:id="96"/>
-    <w:bookmarkStart w:id="104" w:name="lintr"/>
+    <w:bookmarkEnd w:id="99"/>
+    <w:bookmarkStart w:id="107" w:name="lintr"/>
     <w:p>
       <w:pPr>
         <w:pStyle w:val="Heading4"/>
       </w:pPr>
-      <w:hyperlink r:id="rId97">
+      <w:hyperlink r:id="rId100">
         <w:r>
           <w:rPr>
             <w:rStyle w:val="VerbatimChar"/>
@@ -19405,7 +19860,7 @@
       <w:r>
         <w:t xml:space="preserve"> </w:t>
       </w:r>
-      <w:hyperlink r:id="rId97">
+      <w:hyperlink r:id="rId100">
         <w:r>
           <w:rPr>
             <w:rStyle w:val="VerbatimChar"/>
@@ -19455,7 +19910,7 @@
       <w:r>
         <w:t xml:space="preserve"> </w:t>
       </w:r>
-      <w:hyperlink r:id="rId98">
+      <w:hyperlink r:id="rId101">
         <w:r>
           <w:rPr>
             <w:rStyle w:val="Hyperlink"/>
@@ -19485,150 +19940,6 @@
       </w:hyperlink>
       <w:r>
         <w:t xml:space="preserve">.</w:t>
-      </w:r>
-    </w:p>
-    <w:tbl>
-      <w:tblPr>
-        <w:tblStyle w:val="Table"/>
-        <w:tblLook w:firstRow="0" w:lastRow="0" w:firstColumn="0" w:lastColumn="0" w:noHBand="0" w:noVBand="0" w:val="0000"/>
-        <w:tblBorders>
-          <w:top w:val="single" w:sz="4" w:space="0" w:color="0758E5"/>
-          <w:left w:val="single" w:sz="24" w:space="0" w:color="0758E5"/>
-          <w:bottom w:val="single" w:sz="4" w:space="0" w:color="0758E5"/>
-          <w:right w:val="single" w:sz="4" w:space="0" w:color="0758E5"/>
-        </w:tblBorders>
-        <w:tblCellMar>
-          <w:left w:w="144" w:type="dxa"/>
-          <w:right w:w="144" w:type="dxa"/>
-        </w:tblCellMar>
-        <w:tblLook w:firstRow="0" w:lastRow="0" w:firstColumn="0" w:lastColumn="0" w:noHBand="0" w:noVBand="0" w:val="0000"/>
-      </w:tblPr>
-      <w:tr>
-        <w:trPr>
-          <w:cantSplit/>
-        </w:trPr>
-        <w:tc>
-          <w:tcPr>
-            <w:shd w:color="auto" w:fill="dae6fb" w:val="clear"/>
-            <w:tcMar>
-              <w:top w:w="92" w:type="dxa"/>
-              <w:bottom w:w="92" w:type="dxa"/>
-            </w:tcMar>
-          </w:tcPr>
-          <w:p>
-            <w:pPr>
-              <w:pStyle w:val="BodyText"/>
-            </w:pPr>
-            <w:pPr>
-              <w:spacing w:before="0" w:after="0"/>
-              <w:textAlignment w:val="center"/>
-            </w:pPr>
-            <w:r>
-              <w:drawing>
-                <wp:inline>
-                  <wp:extent cx="152400" cy="152400"/>
-                  <wp:effectExtent b="0" l="0" r="0" t="0"/>
-                  <wp:docPr descr="" title="" id="99" name="Picture"/>
-                  <a:graphic>
-                    <a:graphicData uri="http://schemas.openxmlformats.org/drawingml/2006/picture">
-                      <pic:pic>
-                        <pic:nvPicPr>
-                          <pic:cNvPr descr="/opt/quarto/share/formats/docx/note.png" id="100" name="Picture"/>
-                          <pic:cNvPicPr>
-                            <a:picLocks noChangeArrowheads="1" noChangeAspect="1"/>
-                          </pic:cNvPicPr>
-                        </pic:nvPicPr>
-                        <pic:blipFill>
-                          <a:blip r:embed="rId54"/>
-                          <a:stretch>
-                            <a:fillRect/>
-                          </a:stretch>
-                        </pic:blipFill>
-                        <pic:spPr bwMode="auto">
-                          <a:xfrm>
-                            <a:off x="0" y="0"/>
-                            <a:ext cx="152400" cy="152400"/>
-                          </a:xfrm>
-                          <a:prstGeom prst="rect">
-                            <a:avLst/>
-                          </a:prstGeom>
-                          <a:noFill/>
-                          <a:ln w="9525">
-                            <a:noFill/>
-                            <a:headEnd/>
-                            <a:tailEnd/>
-                          </a:ln>
-                        </pic:spPr>
-                      </pic:pic>
-                    </a:graphicData>
-                  </a:graphic>
-                </wp:inline>
-              </w:drawing>
-            </w:r>
-            <w:r>
-              <w:t xml:space="preserve"> </w:t>
-            </w:r>
-            <w:r>
-              <w:t xml:space="preserve"> </w:t>
-            </w:r>
-            <w:r>
-              <w:t xml:space="preserve">Note</w:t>
-            </w:r>
-          </w:p>
-        </w:tc>
-      </w:tr>
-      <w:tr>
-        <w:trPr>
-          <w:cantSplit/>
-        </w:trPr>
-        <w:tc>
-          <w:tcPr>
-            <w:tcMar>
-              <w:top w:w="108" w:type="dxa"/>
-              <w:bottom w:w="108" w:type="dxa"/>
-            </w:tcMar>
-          </w:tcPr>
-          <w:p>
-            <w:pPr>
-              <w:pStyle w:val="BodyText"/>
-            </w:pPr>
-            <w:pPr>
-              <w:spacing w:before="16" w:after="16"/>
-            </w:pPr>
-            <w:r>
-              <w:t xml:space="preserve">You can customize your settings to set defaults or to exclude files.</w:t>
-            </w:r>
-            <w:r>
-              <w:t xml:space="preserve"> </w:t>
-            </w:r>
-            <w:r>
-              <w:t xml:space="preserve">More details can be found</w:t>
-            </w:r>
-            <w:r>
-              <w:t xml:space="preserve"> </w:t>
-            </w:r>
-            <w:hyperlink r:id="rId101">
-              <w:r>
-                <w:rPr>
-                  <w:rStyle w:val="Hyperlink"/>
-                </w:rPr>
-                <w:t xml:space="preserve">here</w:t>
-              </w:r>
-            </w:hyperlink>
-            <w:r>
-              <w:t xml:space="preserve">.</w:t>
-            </w:r>
-          </w:p>
-          <w:p/>
-        </w:tc>
-      </w:tr>
-    </w:tbl>
-    <w:p>
-      <w:pPr>
-        <w:pStyle w:val="BodyText"/>
-      </w:pPr>
-      <w:r>
-        <w:t xml:space="preserve"> </w:t>
       </w:r>
     </w:p>
     <w:tbl>
@@ -19740,52 +20051,196 @@
               <w:spacing w:before="16" w:after="16"/>
             </w:pPr>
             <w:r>
-              <w:t xml:space="preserve">The</w:t>
+              <w:t xml:space="preserve">You can customize your settings to set defaults or to exclude files.</w:t>
             </w:r>
             <w:r>
               <w:t xml:space="preserve"> </w:t>
             </w:r>
             <w:r>
-              <w:rPr>
-                <w:rStyle w:val="VerbatimChar"/>
-              </w:rPr>
-              <w:t xml:space="preserve">lintr</w:t>
+              <w:t xml:space="preserve">More details can be found</w:t>
             </w:r>
             <w:r>
               <w:t xml:space="preserve"> </w:t>
             </w:r>
-            <w:r>
-              <w:t xml:space="preserve">package goes hand in hand with the</w:t>
-            </w:r>
-            <w:r>
-              <w:t xml:space="preserve"> </w:t>
-            </w:r>
-            <w:r>
-              <w:rPr>
-                <w:rStyle w:val="VerbatimChar"/>
-              </w:rPr>
-              <w:t xml:space="preserve">styler</w:t>
-            </w:r>
-            <w:r>
-              <w:t xml:space="preserve"> </w:t>
-            </w:r>
-            <w:r>
-              <w:t xml:space="preserve">package.</w:t>
-            </w:r>
-            <w:r>
-              <w:t xml:space="preserve"> </w:t>
-            </w:r>
-            <w:r>
-              <w:t xml:space="preserve">The styler can be used to automatically fix the problems that the lintr catches.</w:t>
+            <w:hyperlink r:id="rId104">
+              <w:r>
+                <w:rPr>
+                  <w:rStyle w:val="Hyperlink"/>
+                </w:rPr>
+                <w:t xml:space="preserve">here</w:t>
+              </w:r>
+            </w:hyperlink>
+            <w:r>
+              <w:t xml:space="preserve">.</w:t>
             </w:r>
           </w:p>
           <w:p/>
         </w:tc>
       </w:tr>
     </w:tbl>
-    <w:bookmarkEnd w:id="104"/>
-    <w:bookmarkEnd w:id="105"/>
-    <w:bookmarkStart w:id="109" w:name="using-lintr"/>
+    <w:p>
+      <w:pPr>
+        <w:pStyle w:val="BodyText"/>
+      </w:pPr>
+      <w:r>
+        <w:t xml:space="preserve"> </w:t>
+      </w:r>
+    </w:p>
+    <w:tbl>
+      <w:tblPr>
+        <w:tblStyle w:val="Table"/>
+        <w:tblLook w:firstRow="0" w:lastRow="0" w:firstColumn="0" w:lastColumn="0" w:noHBand="0" w:noVBand="0" w:val="0000"/>
+        <w:tblBorders>
+          <w:top w:val="single" w:sz="4" w:space="0" w:color="0758E5"/>
+          <w:left w:val="single" w:sz="24" w:space="0" w:color="0758E5"/>
+          <w:bottom w:val="single" w:sz="4" w:space="0" w:color="0758E5"/>
+          <w:right w:val="single" w:sz="4" w:space="0" w:color="0758E5"/>
+        </w:tblBorders>
+        <w:tblCellMar>
+          <w:left w:w="144" w:type="dxa"/>
+          <w:right w:w="144" w:type="dxa"/>
+        </w:tblCellMar>
+        <w:tblLook w:firstRow="0" w:lastRow="0" w:firstColumn="0" w:lastColumn="0" w:noHBand="0" w:noVBand="0" w:val="0000"/>
+      </w:tblPr>
+      <w:tr>
+        <w:trPr>
+          <w:cantSplit/>
+        </w:trPr>
+        <w:tc>
+          <w:tcPr>
+            <w:shd w:color="auto" w:fill="dae6fb" w:val="clear"/>
+            <w:tcMar>
+              <w:top w:w="92" w:type="dxa"/>
+              <w:bottom w:w="92" w:type="dxa"/>
+            </w:tcMar>
+          </w:tcPr>
+          <w:p>
+            <w:pPr>
+              <w:pStyle w:val="BodyText"/>
+            </w:pPr>
+            <w:pPr>
+              <w:spacing w:before="0" w:after="0"/>
+              <w:textAlignment w:val="center"/>
+            </w:pPr>
+            <w:r>
+              <w:drawing>
+                <wp:inline>
+                  <wp:extent cx="152400" cy="152400"/>
+                  <wp:effectExtent b="0" l="0" r="0" t="0"/>
+                  <wp:docPr descr="" title="" id="105" name="Picture"/>
+                  <a:graphic>
+                    <a:graphicData uri="http://schemas.openxmlformats.org/drawingml/2006/picture">
+                      <pic:pic>
+                        <pic:nvPicPr>
+                          <pic:cNvPr descr="/opt/quarto/share/formats/docx/note.png" id="106" name="Picture"/>
+                          <pic:cNvPicPr>
+                            <a:picLocks noChangeArrowheads="1" noChangeAspect="1"/>
+                          </pic:cNvPicPr>
+                        </pic:nvPicPr>
+                        <pic:blipFill>
+                          <a:blip r:embed="rId54"/>
+                          <a:stretch>
+                            <a:fillRect/>
+                          </a:stretch>
+                        </pic:blipFill>
+                        <pic:spPr bwMode="auto">
+                          <a:xfrm>
+                            <a:off x="0" y="0"/>
+                            <a:ext cx="152400" cy="152400"/>
+                          </a:xfrm>
+                          <a:prstGeom prst="rect">
+                            <a:avLst/>
+                          </a:prstGeom>
+                          <a:noFill/>
+                          <a:ln w="9525">
+                            <a:noFill/>
+                            <a:headEnd/>
+                            <a:tailEnd/>
+                          </a:ln>
+                        </pic:spPr>
+                      </pic:pic>
+                    </a:graphicData>
+                  </a:graphic>
+                </wp:inline>
+              </w:drawing>
+            </w:r>
+            <w:r>
+              <w:t xml:space="preserve"> </w:t>
+            </w:r>
+            <w:r>
+              <w:t xml:space="preserve"> </w:t>
+            </w:r>
+            <w:r>
+              <w:t xml:space="preserve">Note</w:t>
+            </w:r>
+          </w:p>
+        </w:tc>
+      </w:tr>
+      <w:tr>
+        <w:trPr>
+          <w:cantSplit/>
+        </w:trPr>
+        <w:tc>
+          <w:tcPr>
+            <w:tcMar>
+              <w:top w:w="108" w:type="dxa"/>
+              <w:bottom w:w="108" w:type="dxa"/>
+            </w:tcMar>
+          </w:tcPr>
+          <w:p>
+            <w:pPr>
+              <w:pStyle w:val="BodyText"/>
+            </w:pPr>
+            <w:pPr>
+              <w:spacing w:before="16" w:after="16"/>
+            </w:pPr>
+            <w:r>
+              <w:t xml:space="preserve">The</w:t>
+            </w:r>
+            <w:r>
+              <w:t xml:space="preserve"> </w:t>
+            </w:r>
+            <w:r>
+              <w:rPr>
+                <w:rStyle w:val="VerbatimChar"/>
+              </w:rPr>
+              <w:t xml:space="preserve">lintr</w:t>
+            </w:r>
+            <w:r>
+              <w:t xml:space="preserve"> </w:t>
+            </w:r>
+            <w:r>
+              <w:t xml:space="preserve">package goes hand in hand with the</w:t>
+            </w:r>
+            <w:r>
+              <w:t xml:space="preserve"> </w:t>
+            </w:r>
+            <w:r>
+              <w:rPr>
+                <w:rStyle w:val="VerbatimChar"/>
+              </w:rPr>
+              <w:t xml:space="preserve">styler</w:t>
+            </w:r>
+            <w:r>
+              <w:t xml:space="preserve"> </w:t>
+            </w:r>
+            <w:r>
+              <w:t xml:space="preserve">package.</w:t>
+            </w:r>
+            <w:r>
+              <w:t xml:space="preserve"> </w:t>
+            </w:r>
+            <w:r>
+              <w:t xml:space="preserve">The styler can be used to automatically fix the problems that the lintr catches.</w:t>
+            </w:r>
+          </w:p>
+          <w:p/>
+        </w:tc>
+      </w:tr>
+    </w:tbl>
+    <w:bookmarkEnd w:id="107"/>
+    <w:bookmarkEnd w:id="108"/>
+    <w:bookmarkStart w:id="112" w:name="using-lintr"/>
     <w:p>
       <w:pPr>
         <w:pStyle w:val="Heading3"/>
@@ -19835,18 +20290,18 @@
                 <wp:inline>
                   <wp:extent cx="152400" cy="152400"/>
                   <wp:effectExtent b="0" l="0" r="0" t="0"/>
-                  <wp:docPr descr="" title="" id="106" name="Picture"/>
+                  <wp:docPr descr="" title="" id="109" name="Picture"/>
                   <a:graphic>
                     <a:graphicData uri="http://schemas.openxmlformats.org/drawingml/2006/picture">
                       <pic:pic>
                         <pic:nvPicPr>
-                          <pic:cNvPr descr="/opt/quarto/share/formats/docx/tip.png" id="107" name="Picture"/>
+                          <pic:cNvPr descr="/opt/quarto/share/formats/docx/tip.png" id="110" name="Picture"/>
                           <pic:cNvPicPr>
                             <a:picLocks noChangeArrowheads="1" noChangeAspect="1"/>
                           </pic:cNvPicPr>
                         </pic:nvPicPr>
                         <pic:blipFill>
-                          <a:blip r:embed="rId93"/>
+                          <a:blip r:embed="rId96"/>
                           <a:stretch>
                             <a:fillRect/>
                           </a:stretch>
@@ -20119,7 +20574,7 @@
               <w:pStyle w:val="Compact"/>
               <w:numPr>
                 <w:ilvl w:val="0"/>
-                <w:numId w:val="1031"/>
+                <w:numId w:val="1032"/>
               </w:numPr>
             </w:pPr>
             <w:r>
@@ -20131,7 +20586,7 @@
               <w:pStyle w:val="Compact"/>
               <w:numPr>
                 <w:ilvl w:val="0"/>
-                <w:numId w:val="1031"/>
+                <w:numId w:val="1032"/>
               </w:numPr>
             </w:pPr>
             <w:r>
@@ -20143,7 +20598,7 @@
               <w:pStyle w:val="Compact"/>
               <w:numPr>
                 <w:ilvl w:val="0"/>
-                <w:numId w:val="1031"/>
+                <w:numId w:val="1032"/>
               </w:numPr>
             </w:pPr>
             <w:r>
@@ -20155,7 +20610,7 @@
               <w:pStyle w:val="Compact"/>
               <w:numPr>
                 <w:ilvl w:val="0"/>
-                <w:numId w:val="1031"/>
+                <w:numId w:val="1032"/>
               </w:numPr>
             </w:pPr>
             <w:r>
@@ -20275,7 +20730,7 @@
             <w:r>
               <w:t xml:space="preserve"> </w:t>
             </w:r>
-            <w:hyperlink r:id="rId108">
+            <w:hyperlink r:id="rId111">
               <w:r>
                 <w:rPr>
                   <w:rStyle w:val="VerbatimChar"/>
@@ -20395,8 +20850,8 @@
         </w:tc>
       </w:tr>
     </w:tbl>
-    <w:bookmarkEnd w:id="109"/>
-    <w:bookmarkStart w:id="120" w:name="a-recommended-lintr-configuration"/>
+    <w:bookmarkEnd w:id="112"/>
+    <w:bookmarkStart w:id="123" w:name="a-recommended-lintr-configuration"/>
     <w:p>
       <w:pPr>
         <w:pStyle w:val="Heading3"/>
@@ -20465,7 +20920,7 @@
         <w:pStyle w:val="Compact"/>
         <w:numPr>
           <w:ilvl w:val="0"/>
-          <w:numId w:val="1032"/>
+          <w:numId w:val="1033"/>
         </w:numPr>
       </w:pPr>
       <w:r>
@@ -20500,132 +20955,6 @@
           <w:rStyle w:val="VerbatimChar"/>
         </w:rPr>
         <w:t xml:space="preserve">%&gt;%</w:t>
-      </w:r>
-    </w:p>
-    <w:p>
-      <w:pPr>
-        <w:pStyle w:val="Compact"/>
-        <w:numPr>
-          <w:ilvl w:val="0"/>
-          <w:numId w:val="1032"/>
-        </w:numPr>
-      </w:pPr>
-      <w:r>
-        <w:rPr>
-          <w:rStyle w:val="VerbatimChar"/>
-        </w:rPr>
-        <w:t xml:space="preserve">object_name_linter()</w:t>
-      </w:r>
-      <w:r>
-        <w:t xml:space="preserve">: Enforces</w:t>
-      </w:r>
-      <w:r>
-        <w:t xml:space="preserve"> </w:t>
-      </w:r>
-      <w:r>
-        <w:rPr>
-          <w:rStyle w:val="VerbatimChar"/>
-        </w:rPr>
-        <w:t xml:space="preserve">snake_case</w:t>
-      </w:r>
-      <w:r>
-        <w:t xml:space="preserve"> </w:t>
-      </w:r>
-      <w:r>
-        <w:t xml:space="preserve">with custom regex allowing uppercase acronyms</w:t>
-      </w:r>
-    </w:p>
-    <w:p>
-      <w:pPr>
-        <w:pStyle w:val="Compact"/>
-        <w:numPr>
-          <w:ilvl w:val="0"/>
-          <w:numId w:val="1032"/>
-        </w:numPr>
-      </w:pPr>
-      <w:r>
-        <w:rPr>
-          <w:rStyle w:val="VerbatimChar"/>
-        </w:rPr>
-        <w:t xml:space="preserve">undesirable_function_linter()</w:t>
-      </w:r>
-      <w:r>
-        <w:t xml:space="preserve">: Prohibits base messaging functions and</w:t>
-      </w:r>
-      <w:r>
-        <w:t xml:space="preserve"> </w:t>
-      </w:r>
-      <w:r>
-        <w:rPr>
-          <w:rStyle w:val="VerbatimChar"/>
-        </w:rPr>
-        <w:t xml:space="preserve">library()</w:t>
-      </w:r>
-      <w:r>
-        <w:t xml:space="preserve"> </w:t>
-      </w:r>
-      <w:r>
-        <w:t xml:space="preserve">in package code</w:t>
-      </w:r>
-    </w:p>
-    <w:p>
-      <w:pPr>
-        <w:pStyle w:val="Compact"/>
-        <w:numPr>
-          <w:ilvl w:val="0"/>
-          <w:numId w:val="1032"/>
-        </w:numPr>
-      </w:pPr>
-      <w:r>
-        <w:rPr>
-          <w:rStyle w:val="VerbatimChar"/>
-        </w:rPr>
-        <w:t xml:space="preserve">redundant_equals_linter()</w:t>
-      </w:r>
-      <w:r>
-        <w:t xml:space="preserve">: Catches redundant</w:t>
-      </w:r>
-      <w:r>
-        <w:t xml:space="preserve"> </w:t>
-      </w:r>
-      <w:r>
-        <w:rPr>
-          <w:rStyle w:val="VerbatimChar"/>
-        </w:rPr>
-        <w:t xml:space="preserve">= TRUE</w:t>
-      </w:r>
-      <w:r>
-        <w:t xml:space="preserve"> </w:t>
-      </w:r>
-      <w:r>
-        <w:t xml:space="preserve">when</w:t>
-      </w:r>
-      <w:r>
-        <w:t xml:space="preserve"> </w:t>
-      </w:r>
-      <w:r>
-        <w:rPr>
-          <w:rStyle w:val="VerbatimChar"/>
-        </w:rPr>
-        <w:t xml:space="preserve">TRUE</w:t>
-      </w:r>
-      <w:r>
-        <w:t xml:space="preserve"> </w:t>
-      </w:r>
-      <w:r>
-        <w:t xml:space="preserve">is the default</w:t>
-      </w:r>
-    </w:p>
-    <w:p>
-      <w:pPr>
-        <w:pStyle w:val="FirstParagraph"/>
-      </w:pPr>
-      <w:r>
-        <w:rPr>
-          <w:b/>
-          <w:bCs/>
-        </w:rPr>
-        <w:t xml:space="preserve">Linters to disable:</w:t>
       </w:r>
     </w:p>
     <w:p>
@@ -20634,6 +20963,132 @@
         <w:numPr>
           <w:ilvl w:val="0"/>
           <w:numId w:val="1033"/>
+        </w:numPr>
+      </w:pPr>
+      <w:r>
+        <w:rPr>
+          <w:rStyle w:val="VerbatimChar"/>
+        </w:rPr>
+        <w:t xml:space="preserve">object_name_linter()</w:t>
+      </w:r>
+      <w:r>
+        <w:t xml:space="preserve">: Enforces</w:t>
+      </w:r>
+      <w:r>
+        <w:t xml:space="preserve"> </w:t>
+      </w:r>
+      <w:r>
+        <w:rPr>
+          <w:rStyle w:val="VerbatimChar"/>
+        </w:rPr>
+        <w:t xml:space="preserve">snake_case</w:t>
+      </w:r>
+      <w:r>
+        <w:t xml:space="preserve"> </w:t>
+      </w:r>
+      <w:r>
+        <w:t xml:space="preserve">with custom regex allowing uppercase acronyms</w:t>
+      </w:r>
+    </w:p>
+    <w:p>
+      <w:pPr>
+        <w:pStyle w:val="Compact"/>
+        <w:numPr>
+          <w:ilvl w:val="0"/>
+          <w:numId w:val="1033"/>
+        </w:numPr>
+      </w:pPr>
+      <w:r>
+        <w:rPr>
+          <w:rStyle w:val="VerbatimChar"/>
+        </w:rPr>
+        <w:t xml:space="preserve">undesirable_function_linter()</w:t>
+      </w:r>
+      <w:r>
+        <w:t xml:space="preserve">: Prohibits base messaging functions and</w:t>
+      </w:r>
+      <w:r>
+        <w:t xml:space="preserve"> </w:t>
+      </w:r>
+      <w:r>
+        <w:rPr>
+          <w:rStyle w:val="VerbatimChar"/>
+        </w:rPr>
+        <w:t xml:space="preserve">library()</w:t>
+      </w:r>
+      <w:r>
+        <w:t xml:space="preserve"> </w:t>
+      </w:r>
+      <w:r>
+        <w:t xml:space="preserve">in package code</w:t>
+      </w:r>
+    </w:p>
+    <w:p>
+      <w:pPr>
+        <w:pStyle w:val="Compact"/>
+        <w:numPr>
+          <w:ilvl w:val="0"/>
+          <w:numId w:val="1033"/>
+        </w:numPr>
+      </w:pPr>
+      <w:r>
+        <w:rPr>
+          <w:rStyle w:val="VerbatimChar"/>
+        </w:rPr>
+        <w:t xml:space="preserve">redundant_equals_linter()</w:t>
+      </w:r>
+      <w:r>
+        <w:t xml:space="preserve">: Catches redundant</w:t>
+      </w:r>
+      <w:r>
+        <w:t xml:space="preserve"> </w:t>
+      </w:r>
+      <w:r>
+        <w:rPr>
+          <w:rStyle w:val="VerbatimChar"/>
+        </w:rPr>
+        <w:t xml:space="preserve">= TRUE</w:t>
+      </w:r>
+      <w:r>
+        <w:t xml:space="preserve"> </w:t>
+      </w:r>
+      <w:r>
+        <w:t xml:space="preserve">when</w:t>
+      </w:r>
+      <w:r>
+        <w:t xml:space="preserve"> </w:t>
+      </w:r>
+      <w:r>
+        <w:rPr>
+          <w:rStyle w:val="VerbatimChar"/>
+        </w:rPr>
+        <w:t xml:space="preserve">TRUE</w:t>
+      </w:r>
+      <w:r>
+        <w:t xml:space="preserve"> </w:t>
+      </w:r>
+      <w:r>
+        <w:t xml:space="preserve">is the default</w:t>
+      </w:r>
+    </w:p>
+    <w:p>
+      <w:pPr>
+        <w:pStyle w:val="FirstParagraph"/>
+      </w:pPr>
+      <w:r>
+        <w:rPr>
+          <w:b/>
+          <w:bCs/>
+        </w:rPr>
+        <w:t xml:space="preserve">Linters to disable:</w:t>
+      </w:r>
+    </w:p>
+    <w:p>
+      <w:pPr>
+        <w:pStyle w:val="Compact"/>
+        <w:numPr>
+          <w:ilvl w:val="0"/>
+          <w:numId w:val="1034"/>
         </w:numPr>
       </w:pPr>
       <w:r>
@@ -20698,7 +21153,7 @@
         <w:pStyle w:val="Compact"/>
         <w:numPr>
           <w:ilvl w:val="0"/>
-          <w:numId w:val="1033"/>
+          <w:numId w:val="1034"/>
         </w:numPr>
       </w:pPr>
       <w:r>
@@ -20751,7 +21206,7 @@
         <w:pStyle w:val="Compact"/>
         <w:numPr>
           <w:ilvl w:val="0"/>
-          <w:numId w:val="1034"/>
+          <w:numId w:val="1035"/>
         </w:numPr>
       </w:pPr>
       <w:r>
@@ -20769,7 +21224,7 @@
         <w:pStyle w:val="Compact"/>
         <w:numPr>
           <w:ilvl w:val="0"/>
-          <w:numId w:val="1034"/>
+          <w:numId w:val="1035"/>
         </w:numPr>
       </w:pPr>
       <w:r>
@@ -20799,7 +21254,7 @@
         <w:pStyle w:val="Compact"/>
         <w:numPr>
           <w:ilvl w:val="0"/>
-          <w:numId w:val="1034"/>
+          <w:numId w:val="1035"/>
         </w:numPr>
       </w:pPr>
       <w:r>
@@ -20817,7 +21272,7 @@
         <w:pStyle w:val="Compact"/>
         <w:numPr>
           <w:ilvl w:val="0"/>
-          <w:numId w:val="1034"/>
+          <w:numId w:val="1035"/>
         </w:numPr>
       </w:pPr>
       <w:r>
@@ -20830,12 +21285,12 @@
         <w:t xml:space="preserve">: Undesirable function rules relaxed</w:t>
       </w:r>
     </w:p>
-    <w:bookmarkStart w:id="119" w:name="jarl"/>
+    <w:bookmarkStart w:id="122" w:name="jarl"/>
     <w:p>
       <w:pPr>
         <w:pStyle w:val="Heading4"/>
       </w:pPr>
-      <w:hyperlink r:id="rId110">
+      <w:hyperlink r:id="rId113">
         <w:r>
           <w:rPr>
             <w:rStyle w:val="VerbatimChar"/>
@@ -20848,7 +21303,7 @@
       <w:pPr>
         <w:pStyle w:val="FirstParagraph"/>
       </w:pPr>
-      <w:hyperlink r:id="rId110">
+      <w:hyperlink r:id="rId113">
         <w:r>
           <w:rPr>
             <w:rStyle w:val="VerbatimChar"/>
@@ -20898,7 +21353,7 @@
         <w:t xml:space="preserve">it performs static analysis significantly faster than standard R-based linters.</w:t>
       </w:r>
     </w:p>
-    <w:bookmarkStart w:id="113" w:name="key-features"/>
+    <w:bookmarkStart w:id="116" w:name="key-features"/>
     <w:p>
       <w:pPr>
         <w:pStyle w:val="Heading5"/>
@@ -20912,7 +21367,7 @@
         <w:pStyle w:val="Compact"/>
         <w:numPr>
           <w:ilvl w:val="0"/>
-          <w:numId w:val="1035"/>
+          <w:numId w:val="1036"/>
         </w:numPr>
       </w:pPr>
       <w:r>
@@ -20934,7 +21389,7 @@
         <w:pStyle w:val="Compact"/>
         <w:numPr>
           <w:ilvl w:val="0"/>
-          <w:numId w:val="1035"/>
+          <w:numId w:val="1036"/>
         </w:numPr>
       </w:pPr>
       <w:r>
@@ -20986,7 +21441,7 @@
         <w:pStyle w:val="Compact"/>
         <w:numPr>
           <w:ilvl w:val="0"/>
-          <w:numId w:val="1035"/>
+          <w:numId w:val="1036"/>
         </w:numPr>
       </w:pPr>
       <w:r>
@@ -21017,7 +21472,7 @@
       <w:r>
         <w:t xml:space="preserve"> </w:t>
       </w:r>
-      <w:hyperlink r:id="rId111">
+      <w:hyperlink r:id="rId114">
         <w:r>
           <w:rPr>
             <w:rStyle w:val="Hyperlink"/>
@@ -21034,7 +21489,7 @@
         <w:pStyle w:val="Compact"/>
         <w:numPr>
           <w:ilvl w:val="0"/>
-          <w:numId w:val="1035"/>
+          <w:numId w:val="1036"/>
         </w:numPr>
       </w:pPr>
       <w:r>
@@ -21068,7 +21523,7 @@
         <w:pStyle w:val="Compact"/>
         <w:numPr>
           <w:ilvl w:val="0"/>
-          <w:numId w:val="1035"/>
+          <w:numId w:val="1036"/>
         </w:numPr>
       </w:pPr>
       <w:r>
@@ -21087,7 +21542,7 @@
       <w:r>
         <w:t xml:space="preserve"> </w:t>
       </w:r>
-      <w:hyperlink r:id="rId112">
+      <w:hyperlink r:id="rId115">
         <w:r>
           <w:rPr>
             <w:rStyle w:val="VerbatimChar"/>
@@ -21102,8 +21557,8 @@
         <w:t xml:space="preserve">file in the project root.</w:t>
       </w:r>
     </w:p>
-    <w:bookmarkEnd w:id="113"/>
-    <w:bookmarkStart w:id="115" w:name="basic-usage"/>
+    <w:bookmarkEnd w:id="116"/>
+    <w:bookmarkStart w:id="118" w:name="basic-usage"/>
     <w:p>
       <w:pPr>
         <w:pStyle w:val="Heading5"/>
@@ -21122,7 +21577,7 @@
       <w:r>
         <w:t xml:space="preserve"> </w:t>
       </w:r>
-      <w:hyperlink r:id="rId114">
+      <w:hyperlink r:id="rId117">
         <w:r>
           <w:rPr>
             <w:rStyle w:val="Hyperlink"/>
@@ -21193,8 +21648,8 @@
         <w:t xml:space="preserve">--fix</w:t>
       </w:r>
     </w:p>
-    <w:bookmarkEnd w:id="115"/>
-    <w:bookmarkStart w:id="118" w:name="comparison-with-lintr"/>
+    <w:bookmarkEnd w:id="118"/>
+    <w:bookmarkStart w:id="121" w:name="comparison-with-lintr"/>
     <w:p>
       <w:pPr>
         <w:pStyle w:val="Heading5"/>
@@ -21413,7 +21868,7 @@
             <w:r>
               <w:t xml:space="preserve"> </w:t>
             </w:r>
-            <w:hyperlink r:id="rId108">
+            <w:hyperlink r:id="rId111">
               <w:r>
                 <w:rPr>
                   <w:rStyle w:val="VerbatimChar"/>
@@ -21527,12 +21982,12 @@
                 <wp:inline>
                   <wp:extent cx="152400" cy="152400"/>
                   <wp:effectExtent b="0" l="0" r="0" t="0"/>
-                  <wp:docPr descr="" title="" id="116" name="Picture"/>
+                  <wp:docPr descr="" title="" id="119" name="Picture"/>
                   <a:graphic>
                     <a:graphicData uri="http://schemas.openxmlformats.org/drawingml/2006/picture">
                       <pic:pic>
                         <pic:nvPicPr>
-                          <pic:cNvPr descr="/opt/quarto/share/formats/docx/note.png" id="117" name="Picture"/>
+                          <pic:cNvPr descr="/opt/quarto/share/formats/docx/note.png" id="120" name="Picture"/>
                           <pic:cNvPicPr>
                             <a:picLocks noChangeArrowheads="1" noChangeAspect="1"/>
                           </pic:cNvPicPr>
@@ -21600,7 +22055,7 @@
             <w:r>
               <w:t xml:space="preserve"> </w:t>
             </w:r>
-            <w:hyperlink r:id="rId97">
+            <w:hyperlink r:id="rId100">
               <w:r>
                 <w:rPr>
                   <w:rStyle w:val="VerbatimChar"/>
@@ -21649,7 +22104,7 @@
             <w:r>
               <w:t xml:space="preserve"> </w:t>
             </w:r>
-            <w:hyperlink r:id="rId108">
+            <w:hyperlink r:id="rId111">
               <w:r>
                 <w:rPr>
                   <w:rStyle w:val="VerbatimChar"/>
@@ -21686,10 +22141,10 @@
         </w:tc>
       </w:tr>
     </w:tbl>
-    <w:bookmarkEnd w:id="118"/>
-    <w:bookmarkEnd w:id="119"/>
-    <w:bookmarkEnd w:id="120"/>
-    <w:bookmarkStart w:id="122" w:name="X20514c3690be0e3afe0e3453b36bf4daf01ce44"/>
+    <w:bookmarkEnd w:id="121"/>
+    <w:bookmarkEnd w:id="122"/>
+    <w:bookmarkEnd w:id="123"/>
+    <w:bookmarkStart w:id="125" w:name="X20514c3690be0e3afe0e3453b36bf4daf01ce44"/>
     <w:p>
       <w:pPr>
         <w:pStyle w:val="Heading3"/>
@@ -21729,7 +22184,7 @@
       <w:r>
         <w:t xml:space="preserve"> </w:t>
       </w:r>
-      <w:hyperlink r:id="rId97">
+      <w:hyperlink r:id="rId100">
         <w:r>
           <w:rPr>
             <w:rStyle w:val="VerbatimChar"/>
@@ -21862,7 +22317,7 @@
       <w:r>
         <w:t xml:space="preserve"> </w:t>
       </w:r>
-      <w:hyperlink r:id="rId121">
+      <w:hyperlink r:id="rId124">
         <w:r>
           <w:rPr>
             <w:rStyle w:val="Hyperlink"/>
@@ -21942,9 +22397,9 @@
         <w:t xml:space="preserve">rather than as a side effect of someone else’s change.</w:t>
       </w:r>
     </w:p>
-    <w:bookmarkEnd w:id="122"/>
-    <w:bookmarkEnd w:id="123"/>
-    <w:bookmarkStart w:id="128" w:name="sec-r-resources-style"/>
+    <w:bookmarkEnd w:id="125"/>
+    <w:bookmarkEnd w:id="126"/>
+    <w:bookmarkStart w:id="131" w:name="sec-r-resources-style"/>
     <w:p>
       <w:pPr>
         <w:pStyle w:val="Heading2"/>
@@ -21958,7 +22413,7 @@
         <w:pStyle w:val="Compact"/>
         <w:numPr>
           <w:ilvl w:val="0"/>
-          <w:numId w:val="1036"/>
+          <w:numId w:val="1037"/>
         </w:numPr>
       </w:pPr>
       <w:r>
@@ -21974,8 +22429,8 @@
         <w:t xml:space="preserve">: Detailed coding style conventions for writing clear, consistent R code. Covers naming, syntax, pipes, functions, and more.</w:t>
       </w:r>
     </w:p>
-    <w:bookmarkStart w:id="127" w:name="refs"/>
-    <w:bookmarkStart w:id="124" w:name="ref-hunt1999pragmatic"/>
+    <w:bookmarkStart w:id="130" w:name="refs"/>
+    <w:bookmarkStart w:id="127" w:name="ref-hunt1999pragmatic"/>
     <w:p>
       <w:pPr>
         <w:pStyle w:val="Bibliography"/>
@@ -21997,8 +22452,8 @@
         <w:t xml:space="preserve">. Addison-Wesley.</w:t>
       </w:r>
     </w:p>
-    <w:bookmarkEnd w:id="124"/>
-    <w:bookmarkStart w:id="125" w:name="ref-martin2008cleancode"/>
+    <w:bookmarkEnd w:id="127"/>
+    <w:bookmarkStart w:id="128" w:name="ref-martin2008cleancode"/>
     <w:p>
       <w:pPr>
         <w:pStyle w:val="Bibliography"/>
@@ -22020,8 +22475,8 @@
         <w:t xml:space="preserve">. Prentice Hall.</w:t>
       </w:r>
     </w:p>
-    <w:bookmarkEnd w:id="125"/>
-    <w:bookmarkStart w:id="126" w:name="ref-wickham2023tidyverse"/>
+    <w:bookmarkEnd w:id="128"/>
+    <w:bookmarkStart w:id="129" w:name="ref-wickham2023tidyverse"/>
     <w:p>
       <w:pPr>
         <w:pStyle w:val="Bibliography"/>
@@ -22057,9 +22512,9 @@
         <w:t xml:space="preserve">.</w:t>
       </w:r>
     </w:p>
-    <w:bookmarkEnd w:id="126"/>
-    <w:bookmarkEnd w:id="127"/>
-    <w:bookmarkEnd w:id="128"/>
+    <w:bookmarkEnd w:id="129"/>
+    <w:bookmarkEnd w:id="130"/>
+    <w:bookmarkEnd w:id="131"/>
     <w:sectPr>
       <w:footnotePr>
         <w:numRestart w:val="eachSect"/>
@@ -22588,6 +23043,9 @@
     <w:abstractNumId w:val="991"/>
   </w:num>
   <w:num w:numId="1030">
+    <w:abstractNumId w:val="991"/>
+  </w:num>
+  <w:num w:numId="1031">
     <w:abstractNumId w:val="99411"/>
     <w:lvlOverride w:ilvl="0">
       <w:startOverride w:val="1"/>
@@ -22617,9 +23075,6 @@
       <w:startOverride w:val="1"/>
     </w:lvlOverride>
   </w:num>
-  <w:num w:numId="1031">
-    <w:abstractNumId w:val="991"/>
-  </w:num>
   <w:num w:numId="1032">
     <w:abstractNumId w:val="991"/>
   </w:num>
@@ -22633,6 +23088,9 @@
     <w:abstractNumId w:val="991"/>
   </w:num>
   <w:num w:numId="1036">
+    <w:abstractNumId w:val="991"/>
+  </w:num>
+  <w:num w:numId="1037">
     <w:abstractNumId w:val="991"/>
   </w:num>
 </w:numbering>

</xml_diff>

<commit_message>
Deploying to gh-pages from @ Morrison-Lab/psc@279e81a6bbbd37a722747751d770e76ffd0702ac 🚀
</commit_message>
<xml_diff>
--- a/chapters/coding-style.docx
+++ b/chapters/coding-style.docx
@@ -15,7 +15,7 @@
         <w:pStyle w:val="Date"/>
       </w:pPr>
       <w:r>
-        <w:t xml:space="preserve">Last modified: 2026-10-26 13:09:35 (PDT)</w:t>
+        <w:t xml:space="preserve">Last modified: 2026-10-26 13:51:46 (PDT)</w:t>
       </w:r>
     </w:p>
     <w:p>
@@ -13903,6 +13903,39 @@
           <w:rStyle w:val="CommentTok"/>
         </w:rPr>
         <w:t xml:space="preserve"># instead of grep()</w:t>
+      </w:r>
+      <w:r>
+        <w:br/>
+      </w:r>
+      <w:r>
+        <w:rPr>
+          <w:rStyle w:val="NormalTok"/>
+        </w:rPr>
+        <w:t xml:space="preserve">stringr</w:t>
+      </w:r>
+      <w:r>
+        <w:rPr>
+          <w:rStyle w:val="SpecialCharTok"/>
+        </w:rPr>
+        <w:t xml:space="preserve">::</w:t>
+      </w:r>
+      <w:r>
+        <w:rPr>
+          <w:rStyle w:val="FunctionTok"/>
+        </w:rPr>
+        <w:t xml:space="preserve">str_subset</w:t>
+      </w:r>
+      <w:r>
+        <w:rPr>
+          <w:rStyle w:val="NormalTok"/>
+        </w:rPr>
+        <w:t xml:space="preserve">()      </w:t>
+      </w:r>
+      <w:r>
+        <w:rPr>
+          <w:rStyle w:val="CommentTok"/>
+        </w:rPr>
+        <w:t xml:space="preserve"># instead of grep(value = TRUE)</w:t>
       </w:r>
       <w:r>
         <w:br/>

</xml_diff>